<commit_message>
finalized the project .docx file
</commit_message>
<xml_diff>
--- a/docs/reports/final reports/Пояснительная записка к проекту Умный робот-мышь.docx
+++ b/docs/reports/final reports/Пояснительная записка к проекту Умный робот-мышь.docx
@@ -6084,36 +6084,50 @@
         <w:jc w:val="left"/>
         <w:rPr>
           <w:rFonts w:ascii="Times New Roman" w:hAnsi="Times New Roman" w:eastAsia="Times New Roman" w:cs="Times New Roman"/>
+          <w:b w:val="0"/>
+          <w:bCs w:val="0"/>
+          <w:i w:val="0"/>
+          <w:iCs w:val="0"/>
+          <w:noProof w:val="0"/>
+          <w:sz w:val="18"/>
+          <w:szCs w:val="18"/>
+          <w:lang w:val="en-GB"/>
+        </w:rPr>
+      </w:pPr>
+      <w:r>
+        <w:rPr>
+          <w:rFonts w:ascii="Times New Roman" w:hAnsi="Times New Roman" w:eastAsia="Times New Roman" w:cs="Times New Roman"/>
+          <w:noProof w:val="0"/>
+          <w:color w:val="0E2740"/>
+          <w:sz w:val="18"/>
+          <w:szCs w:val="18"/>
+          <w:lang w:val="en-GB"/>
+        </w:rPr>
+        <w:t>Страуструп</w:t>
+      </w:r>
+      <w:r>
+        <w:rPr>
+          <w:rFonts w:ascii="Times New Roman" w:hAnsi="Times New Roman" w:eastAsia="Times New Roman" w:cs="Times New Roman"/>
+          <w:noProof w:val="0"/>
+          <w:color w:val="0E2740"/>
+          <w:sz w:val="18"/>
+          <w:szCs w:val="18"/>
+          <w:lang w:val="en-GB"/>
+        </w:rPr>
+        <w:t xml:space="preserve"> Б. </w:t>
+      </w:r>
+      <w:r>
+        <w:rPr>
+          <w:rFonts w:ascii="Times New Roman" w:hAnsi="Times New Roman" w:eastAsia="Times New Roman" w:cs="Times New Roman"/>
           <w:i w:val="1"/>
           <w:iCs w:val="1"/>
           <w:noProof w:val="0"/>
-          <w:color w:val="153D63" w:themeColor="text2" w:themeTint="E6" w:themeShade="FF"/>
-          <w:sz w:val="18"/>
-          <w:szCs w:val="18"/>
-          <w:lang w:val="en-GB"/>
-        </w:rPr>
-      </w:pPr>
-      <w:r>
-        <w:rPr>
-          <w:rFonts w:ascii="Times New Roman" w:hAnsi="Times New Roman" w:eastAsia="Times New Roman" w:cs="Times New Roman"/>
-          <w:noProof w:val="0"/>
-          <w:color w:val="153D63" w:themeColor="text2" w:themeTint="E6" w:themeShade="FF"/>
-          <w:sz w:val="18"/>
-          <w:szCs w:val="18"/>
-          <w:lang w:val="en-GB"/>
-        </w:rPr>
-        <w:t>Страуструп</w:t>
-      </w:r>
-      <w:r>
-        <w:rPr>
-          <w:rFonts w:ascii="Times New Roman" w:hAnsi="Times New Roman" w:eastAsia="Times New Roman" w:cs="Times New Roman"/>
-          <w:noProof w:val="0"/>
-          <w:color w:val="153D63" w:themeColor="text2" w:themeTint="E6" w:themeShade="FF"/>
-          <w:sz w:val="18"/>
-          <w:szCs w:val="18"/>
-          <w:lang w:val="en-GB"/>
-        </w:rPr>
-        <w:t xml:space="preserve"> Б. </w:t>
+          <w:color w:val="0E2740"/>
+          <w:sz w:val="18"/>
+          <w:szCs w:val="18"/>
+          <w:lang w:val="en-GB"/>
+        </w:rPr>
+        <w:t>A Tour of C++</w:t>
       </w:r>
       <w:r>
         <w:rPr>
@@ -6121,12 +6135,193 @@
           <w:i w:val="1"/>
           <w:iCs w:val="1"/>
           <w:noProof w:val="0"/>
-          <w:color w:val="153D63" w:themeColor="text2" w:themeTint="E6" w:themeShade="FF"/>
-          <w:sz w:val="18"/>
-          <w:szCs w:val="18"/>
-          <w:lang w:val="en-GB"/>
-        </w:rPr>
-        <w:t>A Tour of C++</w:t>
+          <w:color w:val="0E2740"/>
+          <w:sz w:val="18"/>
+          <w:szCs w:val="18"/>
+          <w:lang w:val="en-GB"/>
+        </w:rPr>
+        <w:t xml:space="preserve"> </w:t>
+      </w:r>
+      <w:r>
+        <w:rPr>
+          <w:rFonts w:ascii="Times New Roman" w:hAnsi="Times New Roman" w:eastAsia="Times New Roman" w:cs="Times New Roman"/>
+          <w:i w:val="1"/>
+          <w:iCs w:val="1"/>
+          <w:noProof w:val="0"/>
+          <w:color w:val="auto"/>
+          <w:sz w:val="18"/>
+          <w:szCs w:val="18"/>
+          <w:lang w:val="en-GB"/>
+        </w:rPr>
+        <w:t xml:space="preserve">- </w:t>
+      </w:r>
+      <w:r>
+        <w:rPr>
+          <w:rFonts w:ascii="Times New Roman" w:hAnsi="Times New Roman" w:eastAsia="Times New Roman" w:cs="Times New Roman"/>
+          <w:b w:val="0"/>
+          <w:bCs w:val="0"/>
+          <w:i w:val="0"/>
+          <w:iCs w:val="0"/>
+          <w:noProof w:val="0"/>
+          <w:sz w:val="18"/>
+          <w:szCs w:val="18"/>
+          <w:lang w:val="en-GB"/>
+        </w:rPr>
+        <w:t>Краткая</w:t>
+      </w:r>
+      <w:r>
+        <w:rPr>
+          <w:rFonts w:ascii="Times New Roman" w:hAnsi="Times New Roman" w:eastAsia="Times New Roman" w:cs="Times New Roman"/>
+          <w:b w:val="0"/>
+          <w:bCs w:val="0"/>
+          <w:i w:val="0"/>
+          <w:iCs w:val="0"/>
+          <w:noProof w:val="0"/>
+          <w:sz w:val="18"/>
+          <w:szCs w:val="18"/>
+          <w:lang w:val="en-GB"/>
+        </w:rPr>
+        <w:t xml:space="preserve"> </w:t>
+      </w:r>
+      <w:r>
+        <w:rPr>
+          <w:rFonts w:ascii="Times New Roman" w:hAnsi="Times New Roman" w:eastAsia="Times New Roman" w:cs="Times New Roman"/>
+          <w:b w:val="0"/>
+          <w:bCs w:val="0"/>
+          <w:i w:val="0"/>
+          <w:iCs w:val="0"/>
+          <w:noProof w:val="0"/>
+          <w:sz w:val="18"/>
+          <w:szCs w:val="18"/>
+          <w:lang w:val="en-GB"/>
+        </w:rPr>
+        <w:t>сводка</w:t>
+      </w:r>
+      <w:r>
+        <w:rPr>
+          <w:rFonts w:ascii="Times New Roman" w:hAnsi="Times New Roman" w:eastAsia="Times New Roman" w:cs="Times New Roman"/>
+          <w:b w:val="0"/>
+          <w:bCs w:val="0"/>
+          <w:i w:val="0"/>
+          <w:iCs w:val="0"/>
+          <w:noProof w:val="0"/>
+          <w:sz w:val="18"/>
+          <w:szCs w:val="18"/>
+          <w:lang w:val="en-GB"/>
+        </w:rPr>
+        <w:t xml:space="preserve"> </w:t>
+      </w:r>
+      <w:r>
+        <w:rPr>
+          <w:rFonts w:ascii="Times New Roman" w:hAnsi="Times New Roman" w:eastAsia="Times New Roman" w:cs="Times New Roman"/>
+          <w:b w:val="0"/>
+          <w:bCs w:val="0"/>
+          <w:i w:val="0"/>
+          <w:iCs w:val="0"/>
+          <w:noProof w:val="0"/>
+          <w:sz w:val="18"/>
+          <w:szCs w:val="18"/>
+          <w:lang w:val="en-GB"/>
+        </w:rPr>
+        <w:t>языка</w:t>
+      </w:r>
+      <w:r>
+        <w:rPr>
+          <w:rFonts w:ascii="Times New Roman" w:hAnsi="Times New Roman" w:eastAsia="Times New Roman" w:cs="Times New Roman"/>
+          <w:b w:val="0"/>
+          <w:bCs w:val="0"/>
+          <w:i w:val="0"/>
+          <w:iCs w:val="0"/>
+          <w:noProof w:val="0"/>
+          <w:sz w:val="18"/>
+          <w:szCs w:val="18"/>
+          <w:lang w:val="en-GB"/>
+        </w:rPr>
+        <w:t xml:space="preserve"> C++ </w:t>
+      </w:r>
+      <w:r>
+        <w:rPr>
+          <w:rFonts w:ascii="Times New Roman" w:hAnsi="Times New Roman" w:eastAsia="Times New Roman" w:cs="Times New Roman"/>
+          <w:b w:val="0"/>
+          <w:bCs w:val="0"/>
+          <w:i w:val="0"/>
+          <w:iCs w:val="0"/>
+          <w:noProof w:val="0"/>
+          <w:sz w:val="18"/>
+          <w:szCs w:val="18"/>
+          <w:lang w:val="en-GB"/>
+        </w:rPr>
+        <w:t>от</w:t>
+      </w:r>
+      <w:r>
+        <w:rPr>
+          <w:rFonts w:ascii="Times New Roman" w:hAnsi="Times New Roman" w:eastAsia="Times New Roman" w:cs="Times New Roman"/>
+          <w:b w:val="0"/>
+          <w:bCs w:val="0"/>
+          <w:i w:val="0"/>
+          <w:iCs w:val="0"/>
+          <w:noProof w:val="0"/>
+          <w:sz w:val="18"/>
+          <w:szCs w:val="18"/>
+          <w:lang w:val="en-GB"/>
+        </w:rPr>
+        <w:t xml:space="preserve"> </w:t>
+      </w:r>
+      <w:r>
+        <w:rPr>
+          <w:rFonts w:ascii="Times New Roman" w:hAnsi="Times New Roman" w:eastAsia="Times New Roman" w:cs="Times New Roman"/>
+          <w:b w:val="0"/>
+          <w:bCs w:val="0"/>
+          <w:i w:val="0"/>
+          <w:iCs w:val="0"/>
+          <w:noProof w:val="0"/>
+          <w:sz w:val="18"/>
+          <w:szCs w:val="18"/>
+          <w:lang w:val="en-GB"/>
+        </w:rPr>
+        <w:t>самого</w:t>
+      </w:r>
+      <w:r>
+        <w:rPr>
+          <w:rFonts w:ascii="Times New Roman" w:hAnsi="Times New Roman" w:eastAsia="Times New Roman" w:cs="Times New Roman"/>
+          <w:b w:val="0"/>
+          <w:bCs w:val="0"/>
+          <w:i w:val="0"/>
+          <w:iCs w:val="0"/>
+          <w:noProof w:val="0"/>
+          <w:sz w:val="18"/>
+          <w:szCs w:val="18"/>
+          <w:lang w:val="en-GB"/>
+        </w:rPr>
+        <w:t xml:space="preserve"> </w:t>
+      </w:r>
+      <w:r>
+        <w:rPr>
+          <w:rFonts w:ascii="Times New Roman" w:hAnsi="Times New Roman" w:eastAsia="Times New Roman" w:cs="Times New Roman"/>
+          <w:b w:val="0"/>
+          <w:bCs w:val="0"/>
+          <w:i w:val="0"/>
+          <w:iCs w:val="0"/>
+          <w:noProof w:val="0"/>
+          <w:sz w:val="18"/>
+          <w:szCs w:val="18"/>
+          <w:lang w:val="en-GB"/>
+        </w:rPr>
+        <w:t>создателя</w:t>
+      </w:r>
+      <w:r>
+        <w:rPr>
+          <w:rFonts w:ascii="Times New Roman" w:hAnsi="Times New Roman" w:eastAsia="Times New Roman" w:cs="Times New Roman"/>
+          <w:b w:val="0"/>
+          <w:bCs w:val="0"/>
+          <w:i w:val="0"/>
+          <w:iCs w:val="0"/>
+          <w:noProof w:val="0"/>
+          <w:sz w:val="18"/>
+          <w:szCs w:val="18"/>
+          <w:lang w:val="en-GB"/>
+        </w:rPr>
+        <w:t>.</w:t>
       </w:r>
     </w:p>
     <w:p>
@@ -6144,16 +6339,13 @@
           <w:rFonts w:ascii="Times New Roman" w:hAnsi="Times New Roman" w:eastAsia="Times New Roman" w:cs="Times New Roman"/>
           <w:i w:val="0"/>
           <w:iCs w:val="0"/>
-          <w:strike w:val="0"/>
-          <w:dstrike w:val="0"/>
-          <w:noProof w:val="0"/>
-          <w:color w:val="153D63" w:themeColor="text2" w:themeTint="E6" w:themeShade="FF"/>
+          <w:noProof w:val="0"/>
           <w:sz w:val="18"/>
           <w:szCs w:val="18"/>
           <w:lang w:val="en-GB"/>
         </w:rPr>
       </w:pPr>
-      <w:hyperlink r:id="R95a4f5e0bf96407e">
+      <w:hyperlink r:id="R8861ebc71d1042a9">
         <w:r>
           <w:rPr>
             <w:rStyle w:val="Hyperlink"/>
@@ -6163,7 +6355,7 @@
             <w:strike w:val="0"/>
             <w:dstrike w:val="0"/>
             <w:noProof w:val="0"/>
-            <w:color w:val="153D63" w:themeColor="text2" w:themeTint="E6" w:themeShade="FF"/>
+            <w:color w:val="0E2740"/>
             <w:sz w:val="18"/>
             <w:szCs w:val="18"/>
             <w:lang w:val="en-GB"/>
@@ -6179,7 +6371,7 @@
             <w:strike w:val="0"/>
             <w:dstrike w:val="0"/>
             <w:noProof w:val="0"/>
-            <w:color w:val="153D63" w:themeColor="text2" w:themeTint="E6" w:themeShade="FF"/>
+            <w:color w:val="0E2740"/>
             <w:sz w:val="18"/>
             <w:szCs w:val="18"/>
             <w:u w:val="none"/>
@@ -6196,7 +6388,7 @@
             <w:strike w:val="0"/>
             <w:dstrike w:val="0"/>
             <w:noProof w:val="0"/>
-            <w:color w:val="153D63" w:themeColor="text2" w:themeTint="E6" w:themeShade="FF"/>
+            <w:color w:val="0E2740"/>
             <w:sz w:val="18"/>
             <w:szCs w:val="18"/>
             <w:u w:val="none"/>
@@ -6205,6 +6397,117 @@
           <w:t>6</w:t>
         </w:r>
       </w:hyperlink>
+      <w:r>
+        <w:rPr>
+          <w:rFonts w:ascii="Times New Roman" w:hAnsi="Times New Roman" w:eastAsia="Times New Roman" w:cs="Times New Roman"/>
+          <w:i w:val="0"/>
+          <w:iCs w:val="0"/>
+          <w:strike w:val="0"/>
+          <w:dstrike w:val="0"/>
+          <w:noProof w:val="0"/>
+          <w:color w:val="0E2740"/>
+          <w:sz w:val="18"/>
+          <w:szCs w:val="18"/>
+          <w:lang w:val="en-GB"/>
+        </w:rPr>
+        <w:t xml:space="preserve"> - </w:t>
+      </w:r>
+      <w:r>
+        <w:rPr>
+          <w:rFonts w:ascii="Times New Roman" w:hAnsi="Times New Roman" w:eastAsia="Times New Roman" w:cs="Times New Roman"/>
+          <w:i w:val="0"/>
+          <w:iCs w:val="0"/>
+          <w:noProof w:val="0"/>
+          <w:sz w:val="18"/>
+          <w:szCs w:val="18"/>
+          <w:lang w:val="en-GB"/>
+        </w:rPr>
+        <w:t>Алгоритмы</w:t>
+      </w:r>
+      <w:r>
+        <w:rPr>
+          <w:rFonts w:ascii="Times New Roman" w:hAnsi="Times New Roman" w:eastAsia="Times New Roman" w:cs="Times New Roman"/>
+          <w:i w:val="0"/>
+          <w:iCs w:val="0"/>
+          <w:noProof w:val="0"/>
+          <w:sz w:val="18"/>
+          <w:szCs w:val="18"/>
+          <w:lang w:val="en-GB"/>
+        </w:rPr>
+        <w:t xml:space="preserve"> </w:t>
+      </w:r>
+      <w:r>
+        <w:rPr>
+          <w:rFonts w:ascii="Times New Roman" w:hAnsi="Times New Roman" w:eastAsia="Times New Roman" w:cs="Times New Roman"/>
+          <w:i w:val="0"/>
+          <w:iCs w:val="0"/>
+          <w:noProof w:val="0"/>
+          <w:sz w:val="18"/>
+          <w:szCs w:val="18"/>
+          <w:lang w:val="en-GB"/>
+        </w:rPr>
+        <w:t>прохождения</w:t>
+      </w:r>
+      <w:r>
+        <w:rPr>
+          <w:rFonts w:ascii="Times New Roman" w:hAnsi="Times New Roman" w:eastAsia="Times New Roman" w:cs="Times New Roman"/>
+          <w:i w:val="0"/>
+          <w:iCs w:val="0"/>
+          <w:noProof w:val="0"/>
+          <w:sz w:val="18"/>
+          <w:szCs w:val="18"/>
+          <w:lang w:val="en-GB"/>
+        </w:rPr>
+        <w:t xml:space="preserve"> </w:t>
+      </w:r>
+      <w:r>
+        <w:rPr>
+          <w:rFonts w:ascii="Times New Roman" w:hAnsi="Times New Roman" w:eastAsia="Times New Roman" w:cs="Times New Roman"/>
+          <w:i w:val="0"/>
+          <w:iCs w:val="0"/>
+          <w:noProof w:val="0"/>
+          <w:sz w:val="18"/>
+          <w:szCs w:val="18"/>
+          <w:lang w:val="en-GB"/>
+        </w:rPr>
+        <w:t>лабиринта</w:t>
+      </w:r>
+      <w:r>
+        <w:rPr>
+          <w:rFonts w:ascii="Times New Roman" w:hAnsi="Times New Roman" w:eastAsia="Times New Roman" w:cs="Times New Roman"/>
+          <w:i w:val="0"/>
+          <w:iCs w:val="0"/>
+          <w:noProof w:val="0"/>
+          <w:sz w:val="18"/>
+          <w:szCs w:val="18"/>
+          <w:lang w:val="en-GB"/>
+        </w:rPr>
+        <w:t xml:space="preserve"> </w:t>
+      </w:r>
+      <w:r>
+        <w:rPr>
+          <w:rFonts w:ascii="Times New Roman" w:hAnsi="Times New Roman" w:eastAsia="Times New Roman" w:cs="Times New Roman"/>
+          <w:i w:val="0"/>
+          <w:iCs w:val="0"/>
+          <w:noProof w:val="0"/>
+          <w:sz w:val="18"/>
+          <w:szCs w:val="18"/>
+          <w:lang w:val="en-GB"/>
+        </w:rPr>
+        <w:t>роботом</w:t>
+      </w:r>
+      <w:r>
+        <w:rPr>
+          <w:rFonts w:ascii="Times New Roman" w:hAnsi="Times New Roman" w:eastAsia="Times New Roman" w:cs="Times New Roman"/>
+          <w:i w:val="0"/>
+          <w:iCs w:val="0"/>
+          <w:noProof w:val="0"/>
+          <w:sz w:val="18"/>
+          <w:szCs w:val="18"/>
+          <w:lang w:val="en-GB"/>
+        </w:rPr>
+        <w:t>.</w:t>
+      </w:r>
     </w:p>
     <w:p>
       <w:pPr>
@@ -6219,18 +6522,17 @@
         <w:jc w:val="left"/>
         <w:rPr>
           <w:rFonts w:ascii="Times New Roman" w:hAnsi="Times New Roman" w:eastAsia="Times New Roman" w:cs="Times New Roman"/>
-          <w:i w:val="0"/>
-          <w:iCs w:val="0"/>
-          <w:strike w:val="0"/>
-          <w:dstrike w:val="0"/>
-          <w:noProof w:val="0"/>
-          <w:color w:val="153D63" w:themeColor="text2" w:themeTint="E6" w:themeShade="FF"/>
+          <w:b w:val="0"/>
+          <w:bCs w:val="0"/>
+          <w:i w:val="0"/>
+          <w:iCs w:val="0"/>
+          <w:noProof w:val="0"/>
           <w:sz w:val="18"/>
           <w:szCs w:val="18"/>
           <w:lang w:val="en-GB"/>
         </w:rPr>
       </w:pPr>
-      <w:hyperlink r:id="Rd1fd3958e9054fa5">
+      <w:hyperlink r:id="R347e743b2e1c4160">
         <w:r>
           <w:rPr>
             <w:rStyle w:val="Hyperlink"/>
@@ -6240,7 +6542,7 @@
             <w:strike w:val="0"/>
             <w:dstrike w:val="0"/>
             <w:noProof w:val="0"/>
-            <w:color w:val="153D63" w:themeColor="text2" w:themeTint="E6" w:themeShade="FF"/>
+            <w:color w:val="0E2740"/>
             <w:sz w:val="18"/>
             <w:szCs w:val="18"/>
             <w:lang w:val="en-GB"/>
@@ -6256,12 +6558,181 @@
           <w:strike w:val="0"/>
           <w:dstrike w:val="0"/>
           <w:noProof w:val="0"/>
-          <w:color w:val="153D63" w:themeColor="text2" w:themeTint="E6" w:themeShade="FF"/>
+          <w:color w:val="0E2740"/>
           <w:sz w:val="18"/>
           <w:szCs w:val="18"/>
           <w:lang w:val="en-GB"/>
         </w:rPr>
         <w:t>1</w:t>
+      </w:r>
+      <w:r>
+        <w:rPr>
+          <w:rFonts w:ascii="Times New Roman" w:hAnsi="Times New Roman" w:eastAsia="Times New Roman" w:cs="Times New Roman"/>
+          <w:i w:val="0"/>
+          <w:iCs w:val="0"/>
+          <w:strike w:val="0"/>
+          <w:dstrike w:val="0"/>
+          <w:noProof w:val="0"/>
+          <w:color w:val="0E2740"/>
+          <w:sz w:val="18"/>
+          <w:szCs w:val="18"/>
+          <w:lang w:val="en-GB"/>
+        </w:rPr>
+        <w:t xml:space="preserve"> - </w:t>
+      </w:r>
+      <w:r>
+        <w:rPr>
+          <w:rFonts w:ascii="Times New Roman" w:hAnsi="Times New Roman" w:eastAsia="Times New Roman" w:cs="Times New Roman"/>
+          <w:b w:val="0"/>
+          <w:bCs w:val="0"/>
+          <w:i w:val="0"/>
+          <w:iCs w:val="0"/>
+          <w:noProof w:val="0"/>
+          <w:sz w:val="18"/>
+          <w:szCs w:val="18"/>
+          <w:lang w:val="en-GB"/>
+        </w:rPr>
+        <w:t>Робот</w:t>
+      </w:r>
+      <w:r>
+        <w:rPr>
+          <w:rFonts w:ascii="Times New Roman" w:hAnsi="Times New Roman" w:eastAsia="Times New Roman" w:cs="Times New Roman"/>
+          <w:b w:val="0"/>
+          <w:bCs w:val="0"/>
+          <w:i w:val="0"/>
+          <w:iCs w:val="0"/>
+          <w:noProof w:val="0"/>
+          <w:sz w:val="18"/>
+          <w:szCs w:val="18"/>
+          <w:lang w:val="en-GB"/>
+        </w:rPr>
+        <w:t xml:space="preserve"> в </w:t>
+      </w:r>
+      <w:r>
+        <w:rPr>
+          <w:rFonts w:ascii="Times New Roman" w:hAnsi="Times New Roman" w:eastAsia="Times New Roman" w:cs="Times New Roman"/>
+          <w:b w:val="0"/>
+          <w:bCs w:val="0"/>
+          <w:i w:val="0"/>
+          <w:iCs w:val="0"/>
+          <w:noProof w:val="0"/>
+          <w:sz w:val="18"/>
+          <w:szCs w:val="18"/>
+          <w:lang w:val="en-GB"/>
+        </w:rPr>
+        <w:t>лабиринте</w:t>
+      </w:r>
+      <w:r>
+        <w:rPr>
+          <w:rFonts w:ascii="Times New Roman" w:hAnsi="Times New Roman" w:eastAsia="Times New Roman" w:cs="Times New Roman"/>
+          <w:b w:val="0"/>
+          <w:bCs w:val="0"/>
+          <w:i w:val="0"/>
+          <w:iCs w:val="0"/>
+          <w:noProof w:val="0"/>
+          <w:sz w:val="18"/>
+          <w:szCs w:val="18"/>
+          <w:lang w:val="en-GB"/>
+        </w:rPr>
+        <w:t xml:space="preserve"> </w:t>
+      </w:r>
+      <w:r>
+        <w:rPr>
+          <w:rFonts w:ascii="Times New Roman" w:hAnsi="Times New Roman" w:eastAsia="Times New Roman" w:cs="Times New Roman"/>
+          <w:b w:val="0"/>
+          <w:bCs w:val="0"/>
+          <w:i w:val="0"/>
+          <w:iCs w:val="0"/>
+          <w:noProof w:val="0"/>
+          <w:sz w:val="18"/>
+          <w:szCs w:val="18"/>
+          <w:lang w:val="en-GB"/>
+        </w:rPr>
+        <w:t>как</w:t>
+      </w:r>
+      <w:r>
+        <w:rPr>
+          <w:rFonts w:ascii="Times New Roman" w:hAnsi="Times New Roman" w:eastAsia="Times New Roman" w:cs="Times New Roman"/>
+          <w:b w:val="0"/>
+          <w:bCs w:val="0"/>
+          <w:i w:val="0"/>
+          <w:iCs w:val="0"/>
+          <w:noProof w:val="0"/>
+          <w:sz w:val="18"/>
+          <w:szCs w:val="18"/>
+          <w:lang w:val="en-GB"/>
+        </w:rPr>
+        <w:t xml:space="preserve"> </w:t>
+      </w:r>
+      <w:r>
+        <w:rPr>
+          <w:rFonts w:ascii="Times New Roman" w:hAnsi="Times New Roman" w:eastAsia="Times New Roman" w:cs="Times New Roman"/>
+          <w:b w:val="0"/>
+          <w:bCs w:val="0"/>
+          <w:i w:val="0"/>
+          <w:iCs w:val="0"/>
+          <w:noProof w:val="0"/>
+          <w:sz w:val="18"/>
+          <w:szCs w:val="18"/>
+          <w:lang w:val="en-GB"/>
+        </w:rPr>
+        <w:t>обучаемая</w:t>
+      </w:r>
+      <w:r>
+        <w:rPr>
+          <w:rFonts w:ascii="Times New Roman" w:hAnsi="Times New Roman" w:eastAsia="Times New Roman" w:cs="Times New Roman"/>
+          <w:b w:val="0"/>
+          <w:bCs w:val="0"/>
+          <w:i w:val="0"/>
+          <w:iCs w:val="0"/>
+          <w:noProof w:val="0"/>
+          <w:sz w:val="18"/>
+          <w:szCs w:val="18"/>
+          <w:lang w:val="en-GB"/>
+        </w:rPr>
+        <w:t xml:space="preserve"> </w:t>
+      </w:r>
+      <w:r>
+        <w:rPr>
+          <w:rFonts w:ascii="Times New Roman" w:hAnsi="Times New Roman" w:eastAsia="Times New Roman" w:cs="Times New Roman"/>
+          <w:b w:val="0"/>
+          <w:bCs w:val="0"/>
+          <w:i w:val="0"/>
+          <w:iCs w:val="0"/>
+          <w:noProof w:val="0"/>
+          <w:sz w:val="18"/>
+          <w:szCs w:val="18"/>
+          <w:lang w:val="en-GB"/>
+        </w:rPr>
+        <w:t>нейроморфная</w:t>
+      </w:r>
+      <w:r>
+        <w:rPr>
+          <w:rFonts w:ascii="Times New Roman" w:hAnsi="Times New Roman" w:eastAsia="Times New Roman" w:cs="Times New Roman"/>
+          <w:b w:val="0"/>
+          <w:bCs w:val="0"/>
+          <w:i w:val="0"/>
+          <w:iCs w:val="0"/>
+          <w:noProof w:val="0"/>
+          <w:sz w:val="18"/>
+          <w:szCs w:val="18"/>
+          <w:lang w:val="en-GB"/>
+        </w:rPr>
+        <w:t xml:space="preserve"> </w:t>
+      </w:r>
+      <w:r>
+        <w:rPr>
+          <w:rFonts w:ascii="Times New Roman" w:hAnsi="Times New Roman" w:eastAsia="Times New Roman" w:cs="Times New Roman"/>
+          <w:b w:val="0"/>
+          <w:bCs w:val="0"/>
+          <w:i w:val="0"/>
+          <w:iCs w:val="0"/>
+          <w:noProof w:val="0"/>
+          <w:sz w:val="18"/>
+          <w:szCs w:val="18"/>
+          <w:lang w:val="en-GB"/>
+        </w:rPr>
+        <w:t>система</w:t>
       </w:r>
     </w:p>
     <w:p>
@@ -6281,14 +6752,16 @@
           <w:bCs w:val="0"/>
           <w:i w:val="0"/>
           <w:iCs w:val="0"/>
-          <w:noProof w:val="0"/>
-          <w:color w:val="153D63" w:themeColor="text2" w:themeTint="E6" w:themeShade="FF"/>
+          <w:strike w:val="0"/>
+          <w:dstrike w:val="0"/>
+          <w:noProof w:val="0"/>
+          <w:color w:val="auto" w:themeColor="text2" w:themeTint="E6" w:themeShade="FF"/>
           <w:sz w:val="18"/>
           <w:szCs w:val="18"/>
           <w:lang w:val="en-GB"/>
         </w:rPr>
       </w:pPr>
-      <w:hyperlink r:id="Rb251172d4fa344fa">
+      <w:hyperlink r:id="R22b5d4ffb4eb4b5d">
         <w:r>
           <w:rPr>
             <w:rStyle w:val="Hyperlink"/>
@@ -6300,7 +6773,7 @@
             <w:strike w:val="0"/>
             <w:dstrike w:val="0"/>
             <w:noProof w:val="0"/>
-            <w:color w:val="153D63" w:themeColor="text2" w:themeTint="E6" w:themeShade="FF"/>
+            <w:color w:val="0E2740"/>
             <w:sz w:val="18"/>
             <w:szCs w:val="18"/>
             <w:lang w:val="en-GB"/>
@@ -6308,6 +6781,57 @@
           <w:t>https://scientificrussia.ru/articles/umnyj-robot-nasel-vyhod-iz-labirinta-opiraas-na-svoj-opyt</w:t>
         </w:r>
       </w:hyperlink>
+      <w:r>
+        <w:rPr>
+          <w:rFonts w:ascii="Times New Roman" w:hAnsi="Times New Roman" w:eastAsia="Times New Roman" w:cs="Times New Roman"/>
+          <w:b w:val="0"/>
+          <w:bCs w:val="0"/>
+          <w:i w:val="0"/>
+          <w:iCs w:val="0"/>
+          <w:strike w:val="0"/>
+          <w:dstrike w:val="0"/>
+          <w:noProof w:val="0"/>
+          <w:color w:val="0E2740"/>
+          <w:sz w:val="18"/>
+          <w:szCs w:val="18"/>
+          <w:lang w:val="en-GB"/>
+        </w:rPr>
+        <w:t xml:space="preserve"> - </w:t>
+      </w:r>
+      <w:r>
+        <w:rPr>
+          <w:rFonts w:ascii="Times New Roman" w:hAnsi="Times New Roman" w:eastAsia="Times New Roman" w:cs="Times New Roman"/>
+          <w:b w:val="0"/>
+          <w:bCs w:val="0"/>
+          <w:i w:val="0"/>
+          <w:iCs w:val="0"/>
+          <w:strike w:val="0"/>
+          <w:dstrike w:val="0"/>
+          <w:noProof w:val="0"/>
+          <w:color w:val="auto"/>
+          <w:sz w:val="18"/>
+          <w:szCs w:val="18"/>
+          <w:lang w:val="en-GB"/>
+        </w:rPr>
+        <w:t>Прохождение лабиринта</w:t>
+      </w:r>
+      <w:r>
+        <w:rPr>
+          <w:rFonts w:ascii="Times New Roman" w:hAnsi="Times New Roman" w:eastAsia="Times New Roman" w:cs="Times New Roman"/>
+          <w:b w:val="0"/>
+          <w:bCs w:val="0"/>
+          <w:i w:val="0"/>
+          <w:iCs w:val="0"/>
+          <w:strike w:val="0"/>
+          <w:dstrike w:val="0"/>
+          <w:noProof w:val="0"/>
+          <w:color w:val="auto"/>
+          <w:sz w:val="18"/>
+          <w:szCs w:val="18"/>
+          <w:lang w:val="en-GB"/>
+        </w:rPr>
+        <w:t xml:space="preserve"> с опытом</w:t>
+      </w:r>
     </w:p>
     <w:p>
       <w:pPr>
@@ -6322,18 +6846,15 @@
         <w:jc w:val="left"/>
         <w:rPr>
           <w:rFonts w:ascii="Times New Roman" w:hAnsi="Times New Roman" w:eastAsia="Times New Roman" w:cs="Times New Roman"/>
-          <w:b w:val="0"/>
-          <w:bCs w:val="0"/>
-          <w:i w:val="0"/>
-          <w:iCs w:val="0"/>
-          <w:noProof w:val="0"/>
-          <w:color w:val="153D63" w:themeColor="text2" w:themeTint="E6" w:themeShade="FF"/>
+          <w:i w:val="0"/>
+          <w:iCs w:val="0"/>
+          <w:noProof w:val="0"/>
           <w:sz w:val="18"/>
           <w:szCs w:val="18"/>
           <w:lang w:val="en-GB"/>
         </w:rPr>
       </w:pPr>
-      <w:hyperlink r:id="R00a6ab8c64c44f46">
+      <w:hyperlink r:id="R3c30e80407714bf7">
         <w:r>
           <w:rPr>
             <w:rStyle w:val="Hyperlink"/>
@@ -6345,7 +6866,7 @@
             <w:strike w:val="0"/>
             <w:dstrike w:val="0"/>
             <w:noProof w:val="0"/>
-            <w:color w:val="153D63" w:themeColor="text2" w:themeTint="E6" w:themeShade="FF"/>
+            <w:color w:val="0E2740"/>
             <w:sz w:val="18"/>
             <w:szCs w:val="18"/>
             <w:lang w:val="en-GB"/>
@@ -6353,6 +6874,83 @@
           <w:t>https://www.youtube.com/playlist?list=PLa1cUb7v6QqbjhMEoV25F3yslIbCjdnHU</w:t>
         </w:r>
       </w:hyperlink>
+      <w:r>
+        <w:rPr>
+          <w:rFonts w:ascii="Times New Roman" w:hAnsi="Times New Roman" w:eastAsia="Times New Roman" w:cs="Times New Roman"/>
+          <w:b w:val="0"/>
+          <w:bCs w:val="0"/>
+          <w:i w:val="0"/>
+          <w:iCs w:val="0"/>
+          <w:strike w:val="0"/>
+          <w:dstrike w:val="0"/>
+          <w:noProof w:val="0"/>
+          <w:color w:val="0E2740"/>
+          <w:sz w:val="18"/>
+          <w:szCs w:val="18"/>
+          <w:lang w:val="en-GB"/>
+        </w:rPr>
+        <w:t xml:space="preserve"> - </w:t>
+      </w:r>
+      <w:r>
+        <w:rPr>
+          <w:rFonts w:ascii="Times New Roman" w:hAnsi="Times New Roman" w:eastAsia="Times New Roman" w:cs="Times New Roman"/>
+          <w:i w:val="0"/>
+          <w:iCs w:val="0"/>
+          <w:noProof w:val="0"/>
+          <w:sz w:val="18"/>
+          <w:szCs w:val="18"/>
+          <w:lang w:val="en-GB"/>
+        </w:rPr>
+        <w:t>Демонстрация</w:t>
+      </w:r>
+      <w:r>
+        <w:rPr>
+          <w:rFonts w:ascii="Times New Roman" w:hAnsi="Times New Roman" w:eastAsia="Times New Roman" w:cs="Times New Roman"/>
+          <w:i w:val="0"/>
+          <w:iCs w:val="0"/>
+          <w:noProof w:val="0"/>
+          <w:sz w:val="18"/>
+          <w:szCs w:val="18"/>
+          <w:lang w:val="en-GB"/>
+        </w:rPr>
+        <w:t xml:space="preserve"> </w:t>
+      </w:r>
+      <w:r>
+        <w:rPr>
+          <w:rFonts w:ascii="Times New Roman" w:hAnsi="Times New Roman" w:eastAsia="Times New Roman" w:cs="Times New Roman"/>
+          <w:i w:val="0"/>
+          <w:iCs w:val="0"/>
+          <w:noProof w:val="0"/>
+          <w:sz w:val="18"/>
+          <w:szCs w:val="18"/>
+          <w:lang w:val="en-GB"/>
+        </w:rPr>
+        <w:t>работы</w:t>
+      </w:r>
+      <w:r>
+        <w:rPr>
+          <w:rFonts w:ascii="Times New Roman" w:hAnsi="Times New Roman" w:eastAsia="Times New Roman" w:cs="Times New Roman"/>
+          <w:i w:val="0"/>
+          <w:iCs w:val="0"/>
+          <w:noProof w:val="0"/>
+          <w:sz w:val="18"/>
+          <w:szCs w:val="18"/>
+          <w:lang w:val="en-GB"/>
+        </w:rPr>
+        <w:t xml:space="preserve"> e-puck</w:t>
+      </w:r>
+      <w:r>
+        <w:rPr>
+          <w:rFonts w:ascii="Times New Roman" w:hAnsi="Times New Roman" w:eastAsia="Times New Roman" w:cs="Times New Roman"/>
+          <w:i w:val="0"/>
+          <w:iCs w:val="0"/>
+          <w:noProof w:val="0"/>
+          <w:sz w:val="18"/>
+          <w:szCs w:val="18"/>
+          <w:lang w:val="en-GB"/>
+        </w:rPr>
+        <w:t xml:space="preserve"> (плейлист)</w:t>
+      </w:r>
     </w:p>
     <w:p>
       <w:pPr>
@@ -6370,13 +6968,12 @@
           <w:i w:val="0"/>
           <w:iCs w:val="0"/>
           <w:noProof w:val="0"/>
-          <w:color w:val="153D63" w:themeColor="text2" w:themeTint="E6" w:themeShade="FF"/>
           <w:sz w:val="18"/>
           <w:szCs w:val="18"/>
           <w:lang w:val="en-GB"/>
         </w:rPr>
       </w:pPr>
-      <w:hyperlink r:id="R0d6f6bf591194324">
+      <w:hyperlink r:id="Re0859bd3c9284f44">
         <w:r>
           <w:rPr>
             <w:rStyle w:val="Hyperlink"/>
@@ -6386,7 +6983,7 @@
             <w:strike w:val="0"/>
             <w:dstrike w:val="0"/>
             <w:noProof w:val="0"/>
-            <w:color w:val="153D63" w:themeColor="text2" w:themeTint="E6" w:themeShade="FF"/>
+            <w:color w:val="0E2740"/>
             <w:sz w:val="18"/>
             <w:szCs w:val="18"/>
             <w:lang w:val="en-GB"/>
@@ -6394,6 +6991,189 @@
           <w:t>https://youtu.be/AuGe_DFHpbc</w:t>
         </w:r>
       </w:hyperlink>
+      <w:r>
+        <w:rPr>
+          <w:rFonts w:ascii="Times New Roman" w:hAnsi="Times New Roman" w:eastAsia="Times New Roman" w:cs="Times New Roman"/>
+          <w:i w:val="0"/>
+          <w:iCs w:val="0"/>
+          <w:strike w:val="0"/>
+          <w:dstrike w:val="0"/>
+          <w:noProof w:val="0"/>
+          <w:color w:val="0E2740"/>
+          <w:sz w:val="18"/>
+          <w:szCs w:val="18"/>
+          <w:lang w:val="en-GB"/>
+        </w:rPr>
+        <w:t xml:space="preserve"> - </w:t>
+      </w:r>
+      <w:r>
+        <w:rPr>
+          <w:rFonts w:ascii="Times New Roman" w:hAnsi="Times New Roman" w:eastAsia="Times New Roman" w:cs="Times New Roman"/>
+          <w:i w:val="0"/>
+          <w:iCs w:val="0"/>
+          <w:noProof w:val="0"/>
+          <w:sz w:val="18"/>
+          <w:szCs w:val="18"/>
+          <w:lang w:val="en-GB"/>
+        </w:rPr>
+        <w:t>Видео</w:t>
+      </w:r>
+      <w:r>
+        <w:rPr>
+          <w:rFonts w:ascii="Times New Roman" w:hAnsi="Times New Roman" w:eastAsia="Times New Roman" w:cs="Times New Roman"/>
+          <w:i w:val="0"/>
+          <w:iCs w:val="0"/>
+          <w:noProof w:val="0"/>
+          <w:sz w:val="18"/>
+          <w:szCs w:val="18"/>
+          <w:lang w:val="en-GB"/>
+        </w:rPr>
+        <w:t xml:space="preserve"> с </w:t>
+      </w:r>
+      <w:r>
+        <w:rPr>
+          <w:rFonts w:ascii="Times New Roman" w:hAnsi="Times New Roman" w:eastAsia="Times New Roman" w:cs="Times New Roman"/>
+          <w:i w:val="0"/>
+          <w:iCs w:val="0"/>
+          <w:noProof w:val="0"/>
+          <w:sz w:val="18"/>
+          <w:szCs w:val="18"/>
+          <w:lang w:val="en-GB"/>
+        </w:rPr>
+        <w:t>соревнований</w:t>
+      </w:r>
+      <w:r>
+        <w:rPr>
+          <w:rFonts w:ascii="Times New Roman" w:hAnsi="Times New Roman" w:eastAsia="Times New Roman" w:cs="Times New Roman"/>
+          <w:i w:val="0"/>
+          <w:iCs w:val="0"/>
+          <w:noProof w:val="0"/>
+          <w:sz w:val="18"/>
+          <w:szCs w:val="18"/>
+          <w:lang w:val="en-GB"/>
+        </w:rPr>
+        <w:t xml:space="preserve"> </w:t>
+      </w:r>
+      <w:r>
+        <w:rPr>
+          <w:rFonts w:ascii="Times New Roman" w:hAnsi="Times New Roman" w:eastAsia="Times New Roman" w:cs="Times New Roman"/>
+          <w:i w:val="0"/>
+          <w:iCs w:val="0"/>
+          <w:noProof w:val="0"/>
+          <w:sz w:val="18"/>
+          <w:szCs w:val="18"/>
+          <w:lang w:val="en-GB"/>
+        </w:rPr>
+        <w:t>по</w:t>
+      </w:r>
+      <w:r>
+        <w:rPr>
+          <w:rFonts w:ascii="Times New Roman" w:hAnsi="Times New Roman" w:eastAsia="Times New Roman" w:cs="Times New Roman"/>
+          <w:i w:val="0"/>
+          <w:iCs w:val="0"/>
+          <w:noProof w:val="0"/>
+          <w:sz w:val="18"/>
+          <w:szCs w:val="18"/>
+          <w:lang w:val="en-GB"/>
+        </w:rPr>
+        <w:t xml:space="preserve"> </w:t>
+      </w:r>
+      <w:r>
+        <w:rPr>
+          <w:rFonts w:ascii="Times New Roman" w:hAnsi="Times New Roman" w:eastAsia="Times New Roman" w:cs="Times New Roman"/>
+          <w:i w:val="0"/>
+          <w:iCs w:val="0"/>
+          <w:noProof w:val="0"/>
+          <w:sz w:val="18"/>
+          <w:szCs w:val="18"/>
+          <w:lang w:val="en-GB"/>
+        </w:rPr>
+        <w:t>скоростному</w:t>
+      </w:r>
+      <w:r>
+        <w:rPr>
+          <w:rFonts w:ascii="Times New Roman" w:hAnsi="Times New Roman" w:eastAsia="Times New Roman" w:cs="Times New Roman"/>
+          <w:i w:val="0"/>
+          <w:iCs w:val="0"/>
+          <w:noProof w:val="0"/>
+          <w:sz w:val="18"/>
+          <w:szCs w:val="18"/>
+          <w:lang w:val="en-GB"/>
+        </w:rPr>
+        <w:t xml:space="preserve"> </w:t>
+      </w:r>
+      <w:r>
+        <w:rPr>
+          <w:rFonts w:ascii="Times New Roman" w:hAnsi="Times New Roman" w:eastAsia="Times New Roman" w:cs="Times New Roman"/>
+          <w:i w:val="0"/>
+          <w:iCs w:val="0"/>
+          <w:noProof w:val="0"/>
+          <w:sz w:val="18"/>
+          <w:szCs w:val="18"/>
+          <w:lang w:val="en-GB"/>
+        </w:rPr>
+        <w:t>прохождению</w:t>
+      </w:r>
+      <w:r>
+        <w:rPr>
+          <w:rFonts w:ascii="Times New Roman" w:hAnsi="Times New Roman" w:eastAsia="Times New Roman" w:cs="Times New Roman"/>
+          <w:i w:val="0"/>
+          <w:iCs w:val="0"/>
+          <w:noProof w:val="0"/>
+          <w:sz w:val="18"/>
+          <w:szCs w:val="18"/>
+          <w:lang w:val="en-GB"/>
+        </w:rPr>
+        <w:t xml:space="preserve"> </w:t>
+      </w:r>
+      <w:r>
+        <w:rPr>
+          <w:rFonts w:ascii="Times New Roman" w:hAnsi="Times New Roman" w:eastAsia="Times New Roman" w:cs="Times New Roman"/>
+          <w:i w:val="0"/>
+          <w:iCs w:val="0"/>
+          <w:noProof w:val="0"/>
+          <w:sz w:val="18"/>
+          <w:szCs w:val="18"/>
+          <w:lang w:val="en-GB"/>
+        </w:rPr>
+        <w:t>лабиринтов</w:t>
+      </w:r>
+      <w:r>
+        <w:rPr>
+          <w:rFonts w:ascii="Times New Roman" w:hAnsi="Times New Roman" w:eastAsia="Times New Roman" w:cs="Times New Roman"/>
+          <w:i w:val="0"/>
+          <w:iCs w:val="0"/>
+          <w:noProof w:val="0"/>
+          <w:sz w:val="18"/>
+          <w:szCs w:val="18"/>
+          <w:lang w:val="en-GB"/>
+        </w:rPr>
+        <w:t xml:space="preserve"> </w:t>
+      </w:r>
+      <w:r>
+        <w:rPr>
+          <w:rFonts w:ascii="Times New Roman" w:hAnsi="Times New Roman" w:eastAsia="Times New Roman" w:cs="Times New Roman"/>
+          <w:i w:val="0"/>
+          <w:iCs w:val="0"/>
+          <w:noProof w:val="0"/>
+          <w:sz w:val="18"/>
+          <w:szCs w:val="18"/>
+          <w:lang w:val="en-GB"/>
+        </w:rPr>
+        <w:t>роботами-мышами</w:t>
+      </w:r>
+      <w:r>
+        <w:rPr>
+          <w:rFonts w:ascii="Times New Roman" w:hAnsi="Times New Roman" w:eastAsia="Times New Roman" w:cs="Times New Roman"/>
+          <w:i w:val="0"/>
+          <w:iCs w:val="0"/>
+          <w:noProof w:val="0"/>
+          <w:sz w:val="18"/>
+          <w:szCs w:val="18"/>
+          <w:lang w:val="en-GB"/>
+        </w:rPr>
+        <w:t>.</w:t>
+      </w:r>
     </w:p>
     <w:p>
       <w:pPr>
@@ -6411,13 +7191,12 @@
           <w:i w:val="0"/>
           <w:iCs w:val="0"/>
           <w:noProof w:val="0"/>
-          <w:color w:val="153D63" w:themeColor="text2" w:themeTint="E6" w:themeShade="FF"/>
           <w:sz w:val="18"/>
           <w:szCs w:val="18"/>
           <w:lang w:val="en-GB"/>
         </w:rPr>
       </w:pPr>
-      <w:hyperlink r:id="R8ffc4f9395034de0">
+      <w:hyperlink r:id="Rd274cdfb4cc0424b">
         <w:r>
           <w:rPr>
             <w:rStyle w:val="Hyperlink"/>
@@ -6427,7 +7206,7 @@
             <w:strike w:val="0"/>
             <w:dstrike w:val="0"/>
             <w:noProof w:val="0"/>
-            <w:color w:val="153D63" w:themeColor="text2" w:themeTint="E6" w:themeShade="FF"/>
+            <w:color w:val="0E2740"/>
             <w:sz w:val="18"/>
             <w:szCs w:val="18"/>
             <w:lang w:val="en-GB"/>
@@ -6435,6 +7214,141 @@
           <w:t>https://youtu.be/9vS9AKm-Bek?si=BDJoYvM0XeT_IEcf</w:t>
         </w:r>
       </w:hyperlink>
+      <w:r>
+        <w:rPr>
+          <w:rFonts w:ascii="Times New Roman" w:hAnsi="Times New Roman" w:eastAsia="Times New Roman" w:cs="Times New Roman"/>
+          <w:i w:val="0"/>
+          <w:iCs w:val="0"/>
+          <w:strike w:val="0"/>
+          <w:dstrike w:val="0"/>
+          <w:noProof w:val="0"/>
+          <w:color w:val="0E2740"/>
+          <w:sz w:val="18"/>
+          <w:szCs w:val="18"/>
+          <w:lang w:val="en-GB"/>
+        </w:rPr>
+        <w:t xml:space="preserve"> - </w:t>
+      </w:r>
+      <w:r>
+        <w:rPr>
+          <w:rFonts w:ascii="Times New Roman" w:hAnsi="Times New Roman" w:eastAsia="Times New Roman" w:cs="Times New Roman"/>
+          <w:i w:val="0"/>
+          <w:iCs w:val="0"/>
+          <w:noProof w:val="0"/>
+          <w:sz w:val="18"/>
+          <w:szCs w:val="18"/>
+          <w:lang w:val="en-GB"/>
+        </w:rPr>
+        <w:t>Как</w:t>
+      </w:r>
+      <w:r>
+        <w:rPr>
+          <w:rFonts w:ascii="Times New Roman" w:hAnsi="Times New Roman" w:eastAsia="Times New Roman" w:cs="Times New Roman"/>
+          <w:i w:val="0"/>
+          <w:iCs w:val="0"/>
+          <w:noProof w:val="0"/>
+          <w:sz w:val="18"/>
+          <w:szCs w:val="18"/>
+          <w:lang w:val="en-GB"/>
+        </w:rPr>
+        <w:t xml:space="preserve"> </w:t>
+      </w:r>
+      <w:r>
+        <w:rPr>
+          <w:rFonts w:ascii="Times New Roman" w:hAnsi="Times New Roman" w:eastAsia="Times New Roman" w:cs="Times New Roman"/>
+          <w:i w:val="0"/>
+          <w:iCs w:val="0"/>
+          <w:noProof w:val="0"/>
+          <w:sz w:val="18"/>
+          <w:szCs w:val="18"/>
+          <w:lang w:val="en-GB"/>
+        </w:rPr>
+        <w:t>разрабатывали</w:t>
+      </w:r>
+      <w:r>
+        <w:rPr>
+          <w:rFonts w:ascii="Times New Roman" w:hAnsi="Times New Roman" w:eastAsia="Times New Roman" w:cs="Times New Roman"/>
+          <w:i w:val="0"/>
+          <w:iCs w:val="0"/>
+          <w:noProof w:val="0"/>
+          <w:sz w:val="18"/>
+          <w:szCs w:val="18"/>
+          <w:lang w:val="en-GB"/>
+        </w:rPr>
+        <w:t xml:space="preserve"> </w:t>
+      </w:r>
+      <w:r>
+        <w:rPr>
+          <w:rFonts w:ascii="Times New Roman" w:hAnsi="Times New Roman" w:eastAsia="Times New Roman" w:cs="Times New Roman"/>
+          <w:i w:val="0"/>
+          <w:iCs w:val="0"/>
+          <w:noProof w:val="0"/>
+          <w:sz w:val="18"/>
+          <w:szCs w:val="18"/>
+          <w:lang w:val="en-GB"/>
+        </w:rPr>
+        <w:t>самого</w:t>
+      </w:r>
+      <w:r>
+        <w:rPr>
+          <w:rFonts w:ascii="Times New Roman" w:hAnsi="Times New Roman" w:eastAsia="Times New Roman" w:cs="Times New Roman"/>
+          <w:i w:val="0"/>
+          <w:iCs w:val="0"/>
+          <w:noProof w:val="0"/>
+          <w:sz w:val="18"/>
+          <w:szCs w:val="18"/>
+          <w:lang w:val="en-GB"/>
+        </w:rPr>
+        <w:t xml:space="preserve"> </w:t>
+      </w:r>
+      <w:r>
+        <w:rPr>
+          <w:rFonts w:ascii="Times New Roman" w:hAnsi="Times New Roman" w:eastAsia="Times New Roman" w:cs="Times New Roman"/>
+          <w:i w:val="0"/>
+          <w:iCs w:val="0"/>
+          <w:noProof w:val="0"/>
+          <w:sz w:val="18"/>
+          <w:szCs w:val="18"/>
+          <w:lang w:val="en-GB"/>
+        </w:rPr>
+        <w:t>быстрого</w:t>
+      </w:r>
+      <w:r>
+        <w:rPr>
+          <w:rFonts w:ascii="Times New Roman" w:hAnsi="Times New Roman" w:eastAsia="Times New Roman" w:cs="Times New Roman"/>
+          <w:i w:val="0"/>
+          <w:iCs w:val="0"/>
+          <w:noProof w:val="0"/>
+          <w:sz w:val="18"/>
+          <w:szCs w:val="18"/>
+          <w:lang w:val="en-GB"/>
+        </w:rPr>
+        <w:t xml:space="preserve"> </w:t>
+      </w:r>
+      <w:r>
+        <w:rPr>
+          <w:rFonts w:ascii="Times New Roman" w:hAnsi="Times New Roman" w:eastAsia="Times New Roman" w:cs="Times New Roman"/>
+          <w:i w:val="0"/>
+          <w:iCs w:val="0"/>
+          <w:noProof w:val="0"/>
+          <w:sz w:val="18"/>
+          <w:szCs w:val="18"/>
+          <w:lang w:val="en-GB"/>
+        </w:rPr>
+        <w:t>робота-мышь</w:t>
+      </w:r>
+      <w:r>
+        <w:rPr>
+          <w:rFonts w:ascii="Times New Roman" w:hAnsi="Times New Roman" w:eastAsia="Times New Roman" w:cs="Times New Roman"/>
+          <w:i w:val="0"/>
+          <w:iCs w:val="0"/>
+          <w:noProof w:val="0"/>
+          <w:sz w:val="18"/>
+          <w:szCs w:val="18"/>
+          <w:lang w:val="en-GB"/>
+        </w:rPr>
+        <w:t>.</w:t>
+      </w:r>
     </w:p>
     <w:p>
       <w:pPr>
@@ -6454,13 +7368,12 @@
           <w:i w:val="0"/>
           <w:iCs w:val="0"/>
           <w:noProof w:val="0"/>
-          <w:color w:val="153D63" w:themeColor="text2" w:themeTint="E6" w:themeShade="FF"/>
           <w:sz w:val="18"/>
           <w:szCs w:val="18"/>
           <w:lang w:val="en-GB"/>
         </w:rPr>
       </w:pPr>
-      <w:hyperlink r:id="R394b888748a34a49">
+      <w:hyperlink r:id="Rb139c73e064d4d27">
         <w:r>
           <w:rPr>
             <w:rStyle w:val="Hyperlink"/>
@@ -6472,7 +7385,7 @@
             <w:strike w:val="0"/>
             <w:dstrike w:val="0"/>
             <w:noProof w:val="0"/>
-            <w:color w:val="153D63" w:themeColor="text2" w:themeTint="E6" w:themeShade="FF"/>
+            <w:color w:val="0E2740"/>
             <w:sz w:val="18"/>
             <w:szCs w:val="18"/>
             <w:lang w:val="en-GB"/>
@@ -6480,6 +7393,107 @@
           <w:t>https://cyberbotics.com/doc/guide/index</w:t>
         </w:r>
       </w:hyperlink>
+      <w:r>
+        <w:rPr>
+          <w:rFonts w:ascii="Times New Roman" w:hAnsi="Times New Roman" w:eastAsia="Times New Roman" w:cs="Times New Roman"/>
+          <w:b w:val="0"/>
+          <w:bCs w:val="0"/>
+          <w:i w:val="0"/>
+          <w:iCs w:val="0"/>
+          <w:strike w:val="0"/>
+          <w:dstrike w:val="0"/>
+          <w:noProof w:val="0"/>
+          <w:color w:val="0E2740"/>
+          <w:sz w:val="18"/>
+          <w:szCs w:val="18"/>
+          <w:lang w:val="en-GB"/>
+        </w:rPr>
+        <w:t xml:space="preserve"> - </w:t>
+      </w:r>
+      <w:r>
+        <w:rPr>
+          <w:rFonts w:ascii="Times New Roman" w:hAnsi="Times New Roman" w:eastAsia="Times New Roman" w:cs="Times New Roman"/>
+          <w:b w:val="0"/>
+          <w:bCs w:val="0"/>
+          <w:i w:val="0"/>
+          <w:iCs w:val="0"/>
+          <w:noProof w:val="0"/>
+          <w:sz w:val="18"/>
+          <w:szCs w:val="18"/>
+          <w:lang w:val="en-GB"/>
+        </w:rPr>
+        <w:t>Оффициальная</w:t>
+      </w:r>
+      <w:r>
+        <w:rPr>
+          <w:rFonts w:ascii="Times New Roman" w:hAnsi="Times New Roman" w:eastAsia="Times New Roman" w:cs="Times New Roman"/>
+          <w:b w:val="0"/>
+          <w:bCs w:val="0"/>
+          <w:i w:val="0"/>
+          <w:iCs w:val="0"/>
+          <w:noProof w:val="0"/>
+          <w:sz w:val="18"/>
+          <w:szCs w:val="18"/>
+          <w:lang w:val="en-GB"/>
+        </w:rPr>
+        <w:t xml:space="preserve"> </w:t>
+      </w:r>
+      <w:r>
+        <w:rPr>
+          <w:rFonts w:ascii="Times New Roman" w:hAnsi="Times New Roman" w:eastAsia="Times New Roman" w:cs="Times New Roman"/>
+          <w:b w:val="0"/>
+          <w:bCs w:val="0"/>
+          <w:i w:val="0"/>
+          <w:iCs w:val="0"/>
+          <w:noProof w:val="0"/>
+          <w:sz w:val="18"/>
+          <w:szCs w:val="18"/>
+          <w:lang w:val="en-GB"/>
+        </w:rPr>
+        <w:t>документация</w:t>
+      </w:r>
+      <w:r>
+        <w:rPr>
+          <w:rFonts w:ascii="Times New Roman" w:hAnsi="Times New Roman" w:eastAsia="Times New Roman" w:cs="Times New Roman"/>
+          <w:b w:val="0"/>
+          <w:bCs w:val="0"/>
+          <w:i w:val="0"/>
+          <w:iCs w:val="0"/>
+          <w:noProof w:val="0"/>
+          <w:sz w:val="18"/>
+          <w:szCs w:val="18"/>
+          <w:lang w:val="en-GB"/>
+        </w:rPr>
+        <w:t xml:space="preserve"> </w:t>
+      </w:r>
+      <w:r>
+        <w:rPr>
+          <w:rFonts w:ascii="Times New Roman" w:hAnsi="Times New Roman" w:eastAsia="Times New Roman" w:cs="Times New Roman"/>
+          <w:b w:val="0"/>
+          <w:bCs w:val="0"/>
+          <w:i w:val="0"/>
+          <w:iCs w:val="0"/>
+          <w:noProof w:val="0"/>
+          <w:sz w:val="18"/>
+          <w:szCs w:val="18"/>
+          <w:lang w:val="en-GB"/>
+        </w:rPr>
+        <w:t>Webots</w:t>
+      </w:r>
+      <w:r>
+        <w:rPr>
+          <w:rFonts w:ascii="Times New Roman" w:hAnsi="Times New Roman" w:eastAsia="Times New Roman" w:cs="Times New Roman"/>
+          <w:b w:val="0"/>
+          <w:bCs w:val="0"/>
+          <w:i w:val="0"/>
+          <w:iCs w:val="0"/>
+          <w:noProof w:val="0"/>
+          <w:sz w:val="18"/>
+          <w:szCs w:val="18"/>
+          <w:lang w:val="en-GB"/>
+        </w:rPr>
+        <w:t>.</w:t>
+      </w:r>
     </w:p>
     <w:p>
       <w:pPr>
@@ -6494,18 +7508,15 @@
         <w:jc w:val="left"/>
         <w:rPr>
           <w:rFonts w:ascii="Times New Roman" w:hAnsi="Times New Roman" w:eastAsia="Times New Roman" w:cs="Times New Roman"/>
-          <w:b w:val="0"/>
-          <w:bCs w:val="0"/>
-          <w:i w:val="0"/>
-          <w:iCs w:val="0"/>
-          <w:noProof w:val="0"/>
-          <w:color w:val="153D63" w:themeColor="text2" w:themeTint="E6" w:themeShade="FF"/>
+          <w:i w:val="0"/>
+          <w:iCs w:val="0"/>
+          <w:noProof w:val="0"/>
           <w:sz w:val="18"/>
           <w:szCs w:val="18"/>
           <w:lang w:val="en-GB"/>
         </w:rPr>
       </w:pPr>
-      <w:hyperlink r:id="Re5fae343871e4096">
+      <w:hyperlink r:id="R2be908890b5f41c6">
         <w:r>
           <w:rPr>
             <w:rStyle w:val="Hyperlink"/>
@@ -6517,7 +7528,7 @@
             <w:strike w:val="0"/>
             <w:dstrike w:val="0"/>
             <w:noProof w:val="0"/>
-            <w:color w:val="153D63" w:themeColor="text2" w:themeTint="E6" w:themeShade="FF"/>
+            <w:color w:val="0E2740"/>
             <w:sz w:val="18"/>
             <w:szCs w:val="18"/>
             <w:lang w:val="en-GB"/>
@@ -6525,6 +7536,143 @@
           <w:t>https://cyberbotics.com/doc/guide/epuck?version=R2022b</w:t>
         </w:r>
       </w:hyperlink>
+      <w:r>
+        <w:rPr>
+          <w:rFonts w:ascii="Times New Roman" w:hAnsi="Times New Roman" w:eastAsia="Times New Roman" w:cs="Times New Roman"/>
+          <w:b w:val="0"/>
+          <w:bCs w:val="0"/>
+          <w:i w:val="0"/>
+          <w:iCs w:val="0"/>
+          <w:strike w:val="0"/>
+          <w:dstrike w:val="0"/>
+          <w:noProof w:val="0"/>
+          <w:color w:val="0E2740"/>
+          <w:sz w:val="18"/>
+          <w:szCs w:val="18"/>
+          <w:lang w:val="en-GB"/>
+        </w:rPr>
+        <w:t xml:space="preserve"> - </w:t>
+      </w:r>
+      <w:r>
+        <w:rPr>
+          <w:rFonts w:ascii="Times New Roman" w:hAnsi="Times New Roman" w:eastAsia="Times New Roman" w:cs="Times New Roman"/>
+          <w:i w:val="0"/>
+          <w:iCs w:val="0"/>
+          <w:noProof w:val="0"/>
+          <w:sz w:val="18"/>
+          <w:szCs w:val="18"/>
+          <w:lang w:val="en-GB"/>
+        </w:rPr>
+        <w:t>Устройство</w:t>
+      </w:r>
+      <w:r>
+        <w:rPr>
+          <w:rFonts w:ascii="Times New Roman" w:hAnsi="Times New Roman" w:eastAsia="Times New Roman" w:cs="Times New Roman"/>
+          <w:i w:val="0"/>
+          <w:iCs w:val="0"/>
+          <w:noProof w:val="0"/>
+          <w:sz w:val="18"/>
+          <w:szCs w:val="18"/>
+          <w:lang w:val="en-GB"/>
+        </w:rPr>
+        <w:t xml:space="preserve"> </w:t>
+      </w:r>
+      <w:r>
+        <w:rPr>
+          <w:rFonts w:ascii="Times New Roman" w:hAnsi="Times New Roman" w:eastAsia="Times New Roman" w:cs="Times New Roman"/>
+          <w:i w:val="0"/>
+          <w:iCs w:val="0"/>
+          <w:noProof w:val="0"/>
+          <w:sz w:val="18"/>
+          <w:szCs w:val="18"/>
+          <w:lang w:val="en-GB"/>
+        </w:rPr>
+        <w:t>робота</w:t>
+      </w:r>
+      <w:r>
+        <w:rPr>
+          <w:rFonts w:ascii="Times New Roman" w:hAnsi="Times New Roman" w:eastAsia="Times New Roman" w:cs="Times New Roman"/>
+          <w:i w:val="0"/>
+          <w:iCs w:val="0"/>
+          <w:noProof w:val="0"/>
+          <w:sz w:val="18"/>
+          <w:szCs w:val="18"/>
+          <w:lang w:val="en-GB"/>
+        </w:rPr>
+        <w:t xml:space="preserve"> e-puck. </w:t>
+      </w:r>
+      <w:r>
+        <w:rPr>
+          <w:rFonts w:ascii="Times New Roman" w:hAnsi="Times New Roman" w:eastAsia="Times New Roman" w:cs="Times New Roman"/>
+          <w:i w:val="0"/>
+          <w:iCs w:val="0"/>
+          <w:noProof w:val="0"/>
+          <w:sz w:val="18"/>
+          <w:szCs w:val="18"/>
+          <w:lang w:val="en-GB"/>
+        </w:rPr>
+        <w:t>Официальная</w:t>
+      </w:r>
+      <w:r>
+        <w:rPr>
+          <w:rFonts w:ascii="Times New Roman" w:hAnsi="Times New Roman" w:eastAsia="Times New Roman" w:cs="Times New Roman"/>
+          <w:i w:val="0"/>
+          <w:iCs w:val="0"/>
+          <w:noProof w:val="0"/>
+          <w:sz w:val="18"/>
+          <w:szCs w:val="18"/>
+          <w:lang w:val="en-GB"/>
+        </w:rPr>
+        <w:t xml:space="preserve"> </w:t>
+      </w:r>
+      <w:r>
+        <w:rPr>
+          <w:rFonts w:ascii="Times New Roman" w:hAnsi="Times New Roman" w:eastAsia="Times New Roman" w:cs="Times New Roman"/>
+          <w:i w:val="0"/>
+          <w:iCs w:val="0"/>
+          <w:noProof w:val="0"/>
+          <w:sz w:val="18"/>
+          <w:szCs w:val="18"/>
+          <w:lang w:val="en-GB"/>
+        </w:rPr>
+        <w:t>документация</w:t>
+      </w:r>
+      <w:r>
+        <w:rPr>
+          <w:rFonts w:ascii="Times New Roman" w:hAnsi="Times New Roman" w:eastAsia="Times New Roman" w:cs="Times New Roman"/>
+          <w:i w:val="0"/>
+          <w:iCs w:val="0"/>
+          <w:noProof w:val="0"/>
+          <w:sz w:val="18"/>
+          <w:szCs w:val="18"/>
+          <w:lang w:val="en-GB"/>
+        </w:rPr>
+        <w:t xml:space="preserve"> </w:t>
+      </w:r>
+      <w:r>
+        <w:rPr>
+          <w:rFonts w:ascii="Times New Roman" w:hAnsi="Times New Roman" w:eastAsia="Times New Roman" w:cs="Times New Roman"/>
+          <w:i w:val="0"/>
+          <w:iCs w:val="0"/>
+          <w:noProof w:val="0"/>
+          <w:sz w:val="18"/>
+          <w:szCs w:val="18"/>
+          <w:lang w:val="en-GB"/>
+        </w:rPr>
+        <w:t>Webots</w:t>
+      </w:r>
+      <w:r>
+        <w:rPr>
+          <w:rFonts w:ascii="Times New Roman" w:hAnsi="Times New Roman" w:eastAsia="Times New Roman" w:cs="Times New Roman"/>
+          <w:i w:val="0"/>
+          <w:iCs w:val="0"/>
+          <w:noProof w:val="0"/>
+          <w:sz w:val="18"/>
+          <w:szCs w:val="18"/>
+          <w:lang w:val="en-GB"/>
+        </w:rPr>
+        <w:t>.</w:t>
+      </w:r>
     </w:p>
     <w:p>
       <w:pPr>
@@ -6542,13 +7690,12 @@
           <w:i w:val="0"/>
           <w:iCs w:val="0"/>
           <w:noProof w:val="0"/>
-          <w:color w:val="153D63" w:themeColor="text2" w:themeTint="E6" w:themeShade="FF"/>
           <w:sz w:val="18"/>
           <w:szCs w:val="18"/>
           <w:lang w:val="en-GB"/>
         </w:rPr>
       </w:pPr>
-      <w:hyperlink r:id="Rb7889308e9a449a7">
+      <w:hyperlink r:id="R083d8d031832445a">
         <w:r>
           <w:rPr>
             <w:rStyle w:val="Hyperlink"/>
@@ -6558,7 +7705,7 @@
             <w:strike w:val="0"/>
             <w:dstrike w:val="0"/>
             <w:noProof w:val="0"/>
-            <w:color w:val="153D63" w:themeColor="text2" w:themeTint="E6" w:themeShade="FF"/>
+            <w:color w:val="0E2740"/>
             <w:sz w:val="18"/>
             <w:szCs w:val="18"/>
             <w:lang w:val="en-GB"/>
@@ -6566,6 +7713,57 @@
           <w:t>https://www.researchgate.net/figure/The-mechanical-structure-of-the-e-puck-in-an-exploded-view_fig4_37468823</w:t>
         </w:r>
       </w:hyperlink>
+      <w:r>
+        <w:rPr>
+          <w:rFonts w:ascii="Times New Roman" w:hAnsi="Times New Roman" w:eastAsia="Times New Roman" w:cs="Times New Roman"/>
+          <w:i w:val="0"/>
+          <w:iCs w:val="0"/>
+          <w:strike w:val="0"/>
+          <w:dstrike w:val="0"/>
+          <w:noProof w:val="0"/>
+          <w:color w:val="0E2740"/>
+          <w:sz w:val="18"/>
+          <w:szCs w:val="18"/>
+          <w:lang w:val="en-GB"/>
+        </w:rPr>
+        <w:t xml:space="preserve"> - </w:t>
+      </w:r>
+      <w:r>
+        <w:rPr>
+          <w:rFonts w:ascii="Times New Roman" w:hAnsi="Times New Roman" w:eastAsia="Times New Roman" w:cs="Times New Roman"/>
+          <w:i w:val="0"/>
+          <w:iCs w:val="0"/>
+          <w:noProof w:val="0"/>
+          <w:sz w:val="18"/>
+          <w:szCs w:val="18"/>
+          <w:lang w:val="en-GB"/>
+        </w:rPr>
+        <w:t>Чертеж</w:t>
+      </w:r>
+      <w:r>
+        <w:rPr>
+          <w:rFonts w:ascii="Times New Roman" w:hAnsi="Times New Roman" w:eastAsia="Times New Roman" w:cs="Times New Roman"/>
+          <w:i w:val="0"/>
+          <w:iCs w:val="0"/>
+          <w:noProof w:val="0"/>
+          <w:sz w:val="18"/>
+          <w:szCs w:val="18"/>
+          <w:lang w:val="en-GB"/>
+        </w:rPr>
+        <w:t xml:space="preserve"> </w:t>
+      </w:r>
+      <w:r>
+        <w:rPr>
+          <w:rFonts w:ascii="Times New Roman" w:hAnsi="Times New Roman" w:eastAsia="Times New Roman" w:cs="Times New Roman"/>
+          <w:i w:val="0"/>
+          <w:iCs w:val="0"/>
+          <w:noProof w:val="0"/>
+          <w:sz w:val="18"/>
+          <w:szCs w:val="18"/>
+          <w:lang w:val="en-GB"/>
+        </w:rPr>
+        <w:t>e-puck</w:t>
+      </w:r>
     </w:p>
     <w:p>
       <w:pPr>
@@ -6580,18 +7778,15 @@
         <w:jc w:val="left"/>
         <w:rPr>
           <w:rFonts w:ascii="Times New Roman" w:hAnsi="Times New Roman" w:eastAsia="Times New Roman" w:cs="Times New Roman"/>
-          <w:b w:val="0"/>
-          <w:bCs w:val="0"/>
-          <w:i w:val="0"/>
-          <w:iCs w:val="0"/>
-          <w:noProof w:val="0"/>
-          <w:color w:val="153D63" w:themeColor="text2" w:themeTint="E6" w:themeShade="FF"/>
+          <w:i w:val="0"/>
+          <w:iCs w:val="0"/>
+          <w:noProof w:val="0"/>
           <w:sz w:val="18"/>
           <w:szCs w:val="18"/>
           <w:lang w:val="en-GB"/>
         </w:rPr>
       </w:pPr>
-      <w:hyperlink r:id="R22b1060d22c34a75">
+      <w:hyperlink r:id="Rf5f1ffbce71c489d">
         <w:r>
           <w:rPr>
             <w:rStyle w:val="Hyperlink"/>
@@ -6603,7 +7798,7 @@
             <w:strike w:val="0"/>
             <w:dstrike w:val="0"/>
             <w:noProof w:val="0"/>
-            <w:color w:val="153D63" w:themeColor="text2" w:themeTint="E6" w:themeShade="FF"/>
+            <w:color w:val="0E2740"/>
             <w:sz w:val="18"/>
             <w:szCs w:val="18"/>
             <w:lang w:val="en-GB"/>
@@ -6611,6 +7806,191 @@
           <w:t>https://is.ifmo.ru/download/maze.pdf</w:t>
         </w:r>
       </w:hyperlink>
+      <w:r>
+        <w:rPr>
+          <w:rFonts w:ascii="Times New Roman" w:hAnsi="Times New Roman" w:eastAsia="Times New Roman" w:cs="Times New Roman"/>
+          <w:b w:val="0"/>
+          <w:bCs w:val="0"/>
+          <w:i w:val="0"/>
+          <w:iCs w:val="0"/>
+          <w:strike w:val="0"/>
+          <w:dstrike w:val="0"/>
+          <w:noProof w:val="0"/>
+          <w:color w:val="0E2740"/>
+          <w:sz w:val="18"/>
+          <w:szCs w:val="18"/>
+          <w:lang w:val="en-GB"/>
+        </w:rPr>
+        <w:t xml:space="preserve"> - </w:t>
+      </w:r>
+      <w:r>
+        <w:rPr>
+          <w:rFonts w:ascii="Times New Roman" w:hAnsi="Times New Roman" w:eastAsia="Times New Roman" w:cs="Times New Roman"/>
+          <w:i w:val="0"/>
+          <w:iCs w:val="0"/>
+          <w:noProof w:val="0"/>
+          <w:sz w:val="18"/>
+          <w:szCs w:val="18"/>
+          <w:lang w:val="en-GB"/>
+        </w:rPr>
+        <w:t>Связанный</w:t>
+      </w:r>
+      <w:r>
+        <w:rPr>
+          <w:rFonts w:ascii="Times New Roman" w:hAnsi="Times New Roman" w:eastAsia="Times New Roman" w:cs="Times New Roman"/>
+          <w:i w:val="0"/>
+          <w:iCs w:val="0"/>
+          <w:noProof w:val="0"/>
+          <w:sz w:val="18"/>
+          <w:szCs w:val="18"/>
+          <w:lang w:val="en-GB"/>
+        </w:rPr>
+        <w:t xml:space="preserve"> </w:t>
+      </w:r>
+      <w:r>
+        <w:rPr>
+          <w:rFonts w:ascii="Times New Roman" w:hAnsi="Times New Roman" w:eastAsia="Times New Roman" w:cs="Times New Roman"/>
+          <w:i w:val="0"/>
+          <w:iCs w:val="0"/>
+          <w:noProof w:val="0"/>
+          <w:sz w:val="18"/>
+          <w:szCs w:val="18"/>
+          <w:lang w:val="en-GB"/>
+        </w:rPr>
+        <w:t>проект</w:t>
+      </w:r>
+      <w:r>
+        <w:rPr>
+          <w:rFonts w:ascii="Times New Roman" w:hAnsi="Times New Roman" w:eastAsia="Times New Roman" w:cs="Times New Roman"/>
+          <w:i w:val="0"/>
+          <w:iCs w:val="0"/>
+          <w:noProof w:val="0"/>
+          <w:sz w:val="18"/>
+          <w:szCs w:val="18"/>
+          <w:lang w:val="en-GB"/>
+        </w:rPr>
+        <w:t xml:space="preserve"> «</w:t>
+      </w:r>
+      <w:r>
+        <w:rPr>
+          <w:rFonts w:ascii="Times New Roman" w:hAnsi="Times New Roman" w:eastAsia="Times New Roman" w:cs="Times New Roman"/>
+          <w:i w:val="0"/>
+          <w:iCs w:val="0"/>
+          <w:noProof w:val="0"/>
+          <w:sz w:val="18"/>
+          <w:szCs w:val="18"/>
+          <w:lang w:val="en-GB"/>
+        </w:rPr>
+        <w:t>Робот</w:t>
+      </w:r>
+      <w:r>
+        <w:rPr>
+          <w:rFonts w:ascii="Times New Roman" w:hAnsi="Times New Roman" w:eastAsia="Times New Roman" w:cs="Times New Roman"/>
+          <w:i w:val="0"/>
+          <w:iCs w:val="0"/>
+          <w:noProof w:val="0"/>
+          <w:sz w:val="18"/>
+          <w:szCs w:val="18"/>
+          <w:lang w:val="en-GB"/>
+        </w:rPr>
+        <w:t xml:space="preserve">, </w:t>
+      </w:r>
+      <w:r>
+        <w:rPr>
+          <w:rFonts w:ascii="Times New Roman" w:hAnsi="Times New Roman" w:eastAsia="Times New Roman" w:cs="Times New Roman"/>
+          <w:i w:val="0"/>
+          <w:iCs w:val="0"/>
+          <w:noProof w:val="0"/>
+          <w:sz w:val="18"/>
+          <w:szCs w:val="18"/>
+          <w:lang w:val="en-GB"/>
+        </w:rPr>
+        <w:t>ищущий</w:t>
+      </w:r>
+      <w:r>
+        <w:rPr>
+          <w:rFonts w:ascii="Times New Roman" w:hAnsi="Times New Roman" w:eastAsia="Times New Roman" w:cs="Times New Roman"/>
+          <w:i w:val="0"/>
+          <w:iCs w:val="0"/>
+          <w:noProof w:val="0"/>
+          <w:sz w:val="18"/>
+          <w:szCs w:val="18"/>
+          <w:lang w:val="en-GB"/>
+        </w:rPr>
+        <w:t xml:space="preserve"> </w:t>
+      </w:r>
+      <w:r>
+        <w:rPr>
+          <w:rFonts w:ascii="Times New Roman" w:hAnsi="Times New Roman" w:eastAsia="Times New Roman" w:cs="Times New Roman"/>
+          <w:i w:val="0"/>
+          <w:iCs w:val="0"/>
+          <w:noProof w:val="0"/>
+          <w:sz w:val="18"/>
+          <w:szCs w:val="18"/>
+          <w:lang w:val="en-GB"/>
+        </w:rPr>
+        <w:t>выход</w:t>
+      </w:r>
+      <w:r>
+        <w:rPr>
+          <w:rFonts w:ascii="Times New Roman" w:hAnsi="Times New Roman" w:eastAsia="Times New Roman" w:cs="Times New Roman"/>
+          <w:i w:val="0"/>
+          <w:iCs w:val="0"/>
+          <w:noProof w:val="0"/>
+          <w:sz w:val="18"/>
+          <w:szCs w:val="18"/>
+          <w:lang w:val="en-GB"/>
+        </w:rPr>
+        <w:t xml:space="preserve"> </w:t>
+      </w:r>
+      <w:r>
+        <w:rPr>
+          <w:rFonts w:ascii="Times New Roman" w:hAnsi="Times New Roman" w:eastAsia="Times New Roman" w:cs="Times New Roman"/>
+          <w:i w:val="0"/>
+          <w:iCs w:val="0"/>
+          <w:noProof w:val="0"/>
+          <w:sz w:val="18"/>
+          <w:szCs w:val="18"/>
+          <w:lang w:val="en-GB"/>
+        </w:rPr>
+        <w:t>из</w:t>
+      </w:r>
+      <w:r>
+        <w:rPr>
+          <w:rFonts w:ascii="Times New Roman" w:hAnsi="Times New Roman" w:eastAsia="Times New Roman" w:cs="Times New Roman"/>
+          <w:i w:val="0"/>
+          <w:iCs w:val="0"/>
+          <w:noProof w:val="0"/>
+          <w:sz w:val="18"/>
+          <w:szCs w:val="18"/>
+          <w:lang w:val="en-GB"/>
+        </w:rPr>
+        <w:t xml:space="preserve"> </w:t>
+      </w:r>
+      <w:r>
+        <w:rPr>
+          <w:rFonts w:ascii="Times New Roman" w:hAnsi="Times New Roman" w:eastAsia="Times New Roman" w:cs="Times New Roman"/>
+          <w:i w:val="0"/>
+          <w:iCs w:val="0"/>
+          <w:noProof w:val="0"/>
+          <w:sz w:val="18"/>
+          <w:szCs w:val="18"/>
+          <w:lang w:val="en-GB"/>
+        </w:rPr>
+        <w:t>лабиринта</w:t>
+      </w:r>
+      <w:r>
+        <w:rPr>
+          <w:rFonts w:ascii="Times New Roman" w:hAnsi="Times New Roman" w:eastAsia="Times New Roman" w:cs="Times New Roman"/>
+          <w:i w:val="0"/>
+          <w:iCs w:val="0"/>
+          <w:noProof w:val="0"/>
+          <w:sz w:val="18"/>
+          <w:szCs w:val="18"/>
+          <w:lang w:val="en-GB"/>
+        </w:rPr>
+        <w:t>».</w:t>
+      </w:r>
     </w:p>
     <w:p>
       <w:pPr>
@@ -6630,13 +8010,12 @@
           <w:i w:val="0"/>
           <w:iCs w:val="0"/>
           <w:noProof w:val="0"/>
-          <w:color w:val="153D63" w:themeColor="text2" w:themeTint="E6" w:themeShade="FF"/>
           <w:sz w:val="18"/>
           <w:szCs w:val="18"/>
           <w:lang w:val="pt-BR"/>
         </w:rPr>
       </w:pPr>
-      <w:hyperlink r:id="R0d533f3ad41e4811">
+      <w:hyperlink r:id="R5d672179250c4952">
         <w:r>
           <w:rPr>
             <w:rStyle w:val="Hyperlink"/>
@@ -6648,7 +8027,7 @@
             <w:strike w:val="0"/>
             <w:dstrike w:val="0"/>
             <w:noProof w:val="0"/>
-            <w:color w:val="153D63" w:themeColor="text2" w:themeTint="E6" w:themeShade="FF"/>
+            <w:color w:val="0E2740"/>
             <w:sz w:val="18"/>
             <w:szCs w:val="18"/>
             <w:lang w:val="pt-BR"/>
@@ -6656,6 +8035,163 @@
           <w:t>https://e-puck.gctronic.com/</w:t>
         </w:r>
       </w:hyperlink>
+      <w:r>
+        <w:rPr>
+          <w:rFonts w:ascii="Times New Roman" w:hAnsi="Times New Roman" w:eastAsia="Times New Roman" w:cs="Times New Roman"/>
+          <w:b w:val="0"/>
+          <w:bCs w:val="0"/>
+          <w:i w:val="0"/>
+          <w:iCs w:val="0"/>
+          <w:strike w:val="0"/>
+          <w:dstrike w:val="0"/>
+          <w:noProof w:val="0"/>
+          <w:color w:val="0E2740"/>
+          <w:sz w:val="18"/>
+          <w:szCs w:val="18"/>
+          <w:lang w:val="pt-BR"/>
+        </w:rPr>
+        <w:t xml:space="preserve"> - </w:t>
+      </w:r>
+      <w:r>
+        <w:rPr>
+          <w:rFonts w:ascii="Times New Roman" w:hAnsi="Times New Roman" w:eastAsia="Times New Roman" w:cs="Times New Roman"/>
+          <w:b w:val="0"/>
+          <w:bCs w:val="0"/>
+          <w:i w:val="0"/>
+          <w:iCs w:val="0"/>
+          <w:noProof w:val="0"/>
+          <w:sz w:val="18"/>
+          <w:szCs w:val="18"/>
+          <w:lang w:val="pt-BR"/>
+        </w:rPr>
+        <w:t>Официальная</w:t>
+      </w:r>
+      <w:r>
+        <w:rPr>
+          <w:rFonts w:ascii="Times New Roman" w:hAnsi="Times New Roman" w:eastAsia="Times New Roman" w:cs="Times New Roman"/>
+          <w:b w:val="0"/>
+          <w:bCs w:val="0"/>
+          <w:i w:val="0"/>
+          <w:iCs w:val="0"/>
+          <w:noProof w:val="0"/>
+          <w:sz w:val="18"/>
+          <w:szCs w:val="18"/>
+          <w:lang w:val="pt-BR"/>
+        </w:rPr>
+        <w:t xml:space="preserve"> </w:t>
+      </w:r>
+      <w:r>
+        <w:rPr>
+          <w:rFonts w:ascii="Times New Roman" w:hAnsi="Times New Roman" w:eastAsia="Times New Roman" w:cs="Times New Roman"/>
+          <w:b w:val="0"/>
+          <w:bCs w:val="0"/>
+          <w:i w:val="0"/>
+          <w:iCs w:val="0"/>
+          <w:noProof w:val="0"/>
+          <w:sz w:val="18"/>
+          <w:szCs w:val="18"/>
+          <w:lang w:val="pt-BR"/>
+        </w:rPr>
+        <w:t>страница</w:t>
+      </w:r>
+      <w:r>
+        <w:rPr>
+          <w:rFonts w:ascii="Times New Roman" w:hAnsi="Times New Roman" w:eastAsia="Times New Roman" w:cs="Times New Roman"/>
+          <w:b w:val="0"/>
+          <w:bCs w:val="0"/>
+          <w:i w:val="0"/>
+          <w:iCs w:val="0"/>
+          <w:noProof w:val="0"/>
+          <w:sz w:val="18"/>
+          <w:szCs w:val="18"/>
+          <w:lang w:val="pt-BR"/>
+        </w:rPr>
+        <w:t xml:space="preserve"> </w:t>
+      </w:r>
+      <w:r>
+        <w:rPr>
+          <w:rFonts w:ascii="Times New Roman" w:hAnsi="Times New Roman" w:eastAsia="Times New Roman" w:cs="Times New Roman"/>
+          <w:b w:val="0"/>
+          <w:bCs w:val="0"/>
+          <w:i w:val="0"/>
+          <w:iCs w:val="0"/>
+          <w:noProof w:val="0"/>
+          <w:sz w:val="18"/>
+          <w:szCs w:val="18"/>
+          <w:lang w:val="pt-BR"/>
+        </w:rPr>
+        <w:t>создателей</w:t>
+      </w:r>
+      <w:r>
+        <w:rPr>
+          <w:rFonts w:ascii="Times New Roman" w:hAnsi="Times New Roman" w:eastAsia="Times New Roman" w:cs="Times New Roman"/>
+          <w:b w:val="0"/>
+          <w:bCs w:val="0"/>
+          <w:i w:val="0"/>
+          <w:iCs w:val="0"/>
+          <w:noProof w:val="0"/>
+          <w:sz w:val="18"/>
+          <w:szCs w:val="18"/>
+          <w:lang w:val="pt-BR"/>
+        </w:rPr>
+        <w:t xml:space="preserve"> </w:t>
+      </w:r>
+      <w:r>
+        <w:rPr>
+          <w:rFonts w:ascii="Times New Roman" w:hAnsi="Times New Roman" w:eastAsia="Times New Roman" w:cs="Times New Roman"/>
+          <w:b w:val="0"/>
+          <w:bCs w:val="0"/>
+          <w:i w:val="0"/>
+          <w:iCs w:val="0"/>
+          <w:noProof w:val="0"/>
+          <w:sz w:val="18"/>
+          <w:szCs w:val="18"/>
+          <w:lang w:val="pt-BR"/>
+        </w:rPr>
+        <w:t>робота</w:t>
+      </w:r>
+      <w:r>
+        <w:rPr>
+          <w:rFonts w:ascii="Times New Roman" w:hAnsi="Times New Roman" w:eastAsia="Times New Roman" w:cs="Times New Roman"/>
+          <w:b w:val="0"/>
+          <w:bCs w:val="0"/>
+          <w:i w:val="0"/>
+          <w:iCs w:val="0"/>
+          <w:noProof w:val="0"/>
+          <w:sz w:val="18"/>
+          <w:szCs w:val="18"/>
+          <w:lang w:val="pt-BR"/>
+        </w:rPr>
+        <w:t xml:space="preserve"> e-</w:t>
+      </w:r>
+      <w:r>
+        <w:rPr>
+          <w:rFonts w:ascii="Times New Roman" w:hAnsi="Times New Roman" w:eastAsia="Times New Roman" w:cs="Times New Roman"/>
+          <w:b w:val="0"/>
+          <w:bCs w:val="0"/>
+          <w:i w:val="0"/>
+          <w:iCs w:val="0"/>
+          <w:noProof w:val="0"/>
+          <w:sz w:val="18"/>
+          <w:szCs w:val="18"/>
+          <w:lang w:val="pt-BR"/>
+        </w:rPr>
+        <w:t>puck</w:t>
+      </w:r>
+      <w:r>
+        <w:rPr>
+          <w:rFonts w:ascii="Times New Roman" w:hAnsi="Times New Roman" w:eastAsia="Times New Roman" w:cs="Times New Roman"/>
+          <w:b w:val="0"/>
+          <w:bCs w:val="0"/>
+          <w:i w:val="0"/>
+          <w:iCs w:val="0"/>
+          <w:noProof w:val="0"/>
+          <w:sz w:val="18"/>
+          <w:szCs w:val="18"/>
+          <w:lang w:val="pt-BR"/>
+        </w:rPr>
+        <w:t>.</w:t>
+      </w:r>
     </w:p>
     <w:p>
       <w:pPr>
@@ -6673,13 +8209,12 @@
           <w:i w:val="0"/>
           <w:iCs w:val="0"/>
           <w:noProof w:val="0"/>
-          <w:color w:val="153D63" w:themeColor="text2" w:themeTint="E6" w:themeShade="FF"/>
           <w:sz w:val="18"/>
           <w:szCs w:val="18"/>
           <w:lang w:val="en-GB"/>
         </w:rPr>
       </w:pPr>
-      <w:hyperlink r:id="R0b9fac7c885d4910">
+      <w:hyperlink r:id="R16af40faf1104fef">
         <w:r>
           <w:rPr>
             <w:rStyle w:val="Hyperlink"/>
@@ -6689,7 +8224,7 @@
             <w:strike w:val="0"/>
             <w:dstrike w:val="0"/>
             <w:noProof w:val="0"/>
-            <w:color w:val="153D63" w:themeColor="text2" w:themeTint="E6" w:themeShade="FF"/>
+            <w:color w:val="0E2740"/>
             <w:sz w:val="18"/>
             <w:szCs w:val="18"/>
             <w:lang w:val="en-GB"/>
@@ -6697,6 +8232,189 @@
           <w:t>http://tohtml.com/cpp/</w:t>
         </w:r>
       </w:hyperlink>
+      <w:r>
+        <w:rPr>
+          <w:rFonts w:ascii="Times New Roman" w:hAnsi="Times New Roman" w:eastAsia="Times New Roman" w:cs="Times New Roman"/>
+          <w:i w:val="0"/>
+          <w:iCs w:val="0"/>
+          <w:strike w:val="0"/>
+          <w:dstrike w:val="0"/>
+          <w:noProof w:val="0"/>
+          <w:color w:val="0E2740"/>
+          <w:sz w:val="18"/>
+          <w:szCs w:val="18"/>
+          <w:lang w:val="en-GB"/>
+        </w:rPr>
+        <w:t xml:space="preserve"> - </w:t>
+      </w:r>
+      <w:r>
+        <w:rPr>
+          <w:rFonts w:ascii="Times New Roman" w:hAnsi="Times New Roman" w:eastAsia="Times New Roman" w:cs="Times New Roman"/>
+          <w:i w:val="0"/>
+          <w:iCs w:val="0"/>
+          <w:noProof w:val="0"/>
+          <w:sz w:val="18"/>
+          <w:szCs w:val="18"/>
+          <w:lang w:val="en-GB"/>
+        </w:rPr>
+        <w:t>Сайт</w:t>
+      </w:r>
+      <w:r>
+        <w:rPr>
+          <w:rFonts w:ascii="Times New Roman" w:hAnsi="Times New Roman" w:eastAsia="Times New Roman" w:cs="Times New Roman"/>
+          <w:i w:val="0"/>
+          <w:iCs w:val="0"/>
+          <w:noProof w:val="0"/>
+          <w:sz w:val="18"/>
+          <w:szCs w:val="18"/>
+          <w:lang w:val="en-GB"/>
+        </w:rPr>
+        <w:t xml:space="preserve"> </w:t>
+      </w:r>
+      <w:r>
+        <w:rPr>
+          <w:rFonts w:ascii="Times New Roman" w:hAnsi="Times New Roman" w:eastAsia="Times New Roman" w:cs="Times New Roman"/>
+          <w:i w:val="0"/>
+          <w:iCs w:val="0"/>
+          <w:noProof w:val="0"/>
+          <w:sz w:val="18"/>
+          <w:szCs w:val="18"/>
+          <w:lang w:val="en-GB"/>
+        </w:rPr>
+        <w:t>по</w:t>
+      </w:r>
+      <w:r>
+        <w:rPr>
+          <w:rFonts w:ascii="Times New Roman" w:hAnsi="Times New Roman" w:eastAsia="Times New Roman" w:cs="Times New Roman"/>
+          <w:i w:val="0"/>
+          <w:iCs w:val="0"/>
+          <w:noProof w:val="0"/>
+          <w:sz w:val="18"/>
+          <w:szCs w:val="18"/>
+          <w:lang w:val="en-GB"/>
+        </w:rPr>
+        <w:t xml:space="preserve"> </w:t>
+      </w:r>
+      <w:r>
+        <w:rPr>
+          <w:rFonts w:ascii="Times New Roman" w:hAnsi="Times New Roman" w:eastAsia="Times New Roman" w:cs="Times New Roman"/>
+          <w:i w:val="0"/>
+          <w:iCs w:val="0"/>
+          <w:noProof w:val="0"/>
+          <w:sz w:val="18"/>
+          <w:szCs w:val="18"/>
+          <w:lang w:val="en-GB"/>
+        </w:rPr>
+        <w:t>подсветке</w:t>
+      </w:r>
+      <w:r>
+        <w:rPr>
+          <w:rFonts w:ascii="Times New Roman" w:hAnsi="Times New Roman" w:eastAsia="Times New Roman" w:cs="Times New Roman"/>
+          <w:i w:val="0"/>
+          <w:iCs w:val="0"/>
+          <w:noProof w:val="0"/>
+          <w:sz w:val="18"/>
+          <w:szCs w:val="18"/>
+          <w:lang w:val="en-GB"/>
+        </w:rPr>
+        <w:t xml:space="preserve"> </w:t>
+      </w:r>
+      <w:r>
+        <w:rPr>
+          <w:rFonts w:ascii="Times New Roman" w:hAnsi="Times New Roman" w:eastAsia="Times New Roman" w:cs="Times New Roman"/>
+          <w:i w:val="0"/>
+          <w:iCs w:val="0"/>
+          <w:noProof w:val="0"/>
+          <w:sz w:val="18"/>
+          <w:szCs w:val="18"/>
+          <w:lang w:val="en-GB"/>
+        </w:rPr>
+        <w:t>синтаксиса</w:t>
+      </w:r>
+      <w:r>
+        <w:rPr>
+          <w:rFonts w:ascii="Times New Roman" w:hAnsi="Times New Roman" w:eastAsia="Times New Roman" w:cs="Times New Roman"/>
+          <w:i w:val="0"/>
+          <w:iCs w:val="0"/>
+          <w:noProof w:val="0"/>
+          <w:sz w:val="18"/>
+          <w:szCs w:val="18"/>
+          <w:lang w:val="en-GB"/>
+        </w:rPr>
+        <w:t xml:space="preserve"> </w:t>
+      </w:r>
+      <w:r>
+        <w:rPr>
+          <w:rFonts w:ascii="Times New Roman" w:hAnsi="Times New Roman" w:eastAsia="Times New Roman" w:cs="Times New Roman"/>
+          <w:i w:val="0"/>
+          <w:iCs w:val="0"/>
+          <w:noProof w:val="0"/>
+          <w:sz w:val="18"/>
+          <w:szCs w:val="18"/>
+          <w:lang w:val="en-GB"/>
+        </w:rPr>
+        <w:t>кода</w:t>
+      </w:r>
+      <w:r>
+        <w:rPr>
+          <w:rFonts w:ascii="Times New Roman" w:hAnsi="Times New Roman" w:eastAsia="Times New Roman" w:cs="Times New Roman"/>
+          <w:i w:val="0"/>
+          <w:iCs w:val="0"/>
+          <w:noProof w:val="0"/>
+          <w:sz w:val="18"/>
+          <w:szCs w:val="18"/>
+          <w:lang w:val="en-GB"/>
+        </w:rPr>
+        <w:t xml:space="preserve"> </w:t>
+      </w:r>
+      <w:r>
+        <w:rPr>
+          <w:rFonts w:ascii="Times New Roman" w:hAnsi="Times New Roman" w:eastAsia="Times New Roman" w:cs="Times New Roman"/>
+          <w:i w:val="0"/>
+          <w:iCs w:val="0"/>
+          <w:noProof w:val="0"/>
+          <w:sz w:val="18"/>
+          <w:szCs w:val="18"/>
+          <w:lang w:val="en-GB"/>
+        </w:rPr>
+        <w:t>для</w:t>
+      </w:r>
+      <w:r>
+        <w:rPr>
+          <w:rFonts w:ascii="Times New Roman" w:hAnsi="Times New Roman" w:eastAsia="Times New Roman" w:cs="Times New Roman"/>
+          <w:i w:val="0"/>
+          <w:iCs w:val="0"/>
+          <w:noProof w:val="0"/>
+          <w:sz w:val="18"/>
+          <w:szCs w:val="18"/>
+          <w:lang w:val="en-GB"/>
+        </w:rPr>
+        <w:t xml:space="preserve"> </w:t>
+      </w:r>
+      <w:r>
+        <w:rPr>
+          <w:rFonts w:ascii="Times New Roman" w:hAnsi="Times New Roman" w:eastAsia="Times New Roman" w:cs="Times New Roman"/>
+          <w:i w:val="0"/>
+          <w:iCs w:val="0"/>
+          <w:noProof w:val="0"/>
+          <w:sz w:val="18"/>
+          <w:szCs w:val="18"/>
+          <w:lang w:val="en-GB"/>
+        </w:rPr>
+        <w:t>документов</w:t>
+      </w:r>
+      <w:r>
+        <w:rPr>
+          <w:rFonts w:ascii="Times New Roman" w:hAnsi="Times New Roman" w:eastAsia="Times New Roman" w:cs="Times New Roman"/>
+          <w:i w:val="0"/>
+          <w:iCs w:val="0"/>
+          <w:noProof w:val="0"/>
+          <w:sz w:val="18"/>
+          <w:szCs w:val="18"/>
+          <w:lang w:val="en-GB"/>
+        </w:rPr>
+        <w:t>.</w:t>
+      </w:r>
     </w:p>
     <w:p>
       <w:pPr>
@@ -6716,13 +8434,12 @@
           <w:i w:val="0"/>
           <w:iCs w:val="0"/>
           <w:noProof w:val="0"/>
-          <w:color w:val="153D63" w:themeColor="text2" w:themeTint="E6" w:themeShade="FF"/>
           <w:sz w:val="18"/>
           <w:szCs w:val="18"/>
           <w:lang w:val="en-GB"/>
         </w:rPr>
       </w:pPr>
-      <w:hyperlink r:id="Rf4f66dd410914772">
+      <w:hyperlink r:id="R001975ad8eb64bdc">
         <w:r>
           <w:rPr>
             <w:rStyle w:val="Hyperlink"/>
@@ -6734,7 +8451,7 @@
             <w:strike w:val="0"/>
             <w:dstrike w:val="0"/>
             <w:noProof w:val="0"/>
-            <w:color w:val="153D63" w:themeColor="text2" w:themeTint="E6" w:themeShade="FF"/>
+            <w:color w:val="0E2740"/>
             <w:sz w:val="18"/>
             <w:szCs w:val="18"/>
             <w:lang w:val="en-GB"/>
@@ -6742,6 +8459,93 @@
           <w:t>https://github.com/SuN4iK/smart-robot-mice</w:t>
         </w:r>
       </w:hyperlink>
+      <w:r>
+        <w:rPr>
+          <w:rFonts w:ascii="Times New Roman" w:hAnsi="Times New Roman" w:eastAsia="Times New Roman" w:cs="Times New Roman"/>
+          <w:b w:val="0"/>
+          <w:bCs w:val="0"/>
+          <w:i w:val="0"/>
+          <w:iCs w:val="0"/>
+          <w:strike w:val="0"/>
+          <w:dstrike w:val="0"/>
+          <w:noProof w:val="0"/>
+          <w:color w:val="0E2740"/>
+          <w:sz w:val="18"/>
+          <w:szCs w:val="18"/>
+          <w:lang w:val="en-GB"/>
+        </w:rPr>
+        <w:t xml:space="preserve"> - </w:t>
+      </w:r>
+      <w:r>
+        <w:rPr>
+          <w:rFonts w:ascii="Times New Roman" w:hAnsi="Times New Roman" w:eastAsia="Times New Roman" w:cs="Times New Roman"/>
+          <w:b w:val="0"/>
+          <w:bCs w:val="0"/>
+          <w:i w:val="0"/>
+          <w:iCs w:val="0"/>
+          <w:noProof w:val="0"/>
+          <w:sz w:val="18"/>
+          <w:szCs w:val="18"/>
+          <w:lang w:val="en-GB"/>
+        </w:rPr>
+        <w:t>Проектный</w:t>
+      </w:r>
+      <w:r>
+        <w:rPr>
+          <w:rFonts w:ascii="Times New Roman" w:hAnsi="Times New Roman" w:eastAsia="Times New Roman" w:cs="Times New Roman"/>
+          <w:b w:val="0"/>
+          <w:bCs w:val="0"/>
+          <w:i w:val="0"/>
+          <w:iCs w:val="0"/>
+          <w:noProof w:val="0"/>
+          <w:sz w:val="18"/>
+          <w:szCs w:val="18"/>
+          <w:lang w:val="en-GB"/>
+        </w:rPr>
+        <w:t xml:space="preserve"> </w:t>
+      </w:r>
+      <w:r>
+        <w:rPr>
+          <w:rFonts w:ascii="Times New Roman" w:hAnsi="Times New Roman" w:eastAsia="Times New Roman" w:cs="Times New Roman"/>
+          <w:b w:val="0"/>
+          <w:bCs w:val="0"/>
+          <w:i w:val="0"/>
+          <w:iCs w:val="0"/>
+          <w:noProof w:val="0"/>
+          <w:sz w:val="18"/>
+          <w:szCs w:val="18"/>
+          <w:lang w:val="en-GB"/>
+        </w:rPr>
+        <w:t>репозиторий</w:t>
+      </w:r>
+      <w:r>
+        <w:rPr>
+          <w:rFonts w:ascii="Times New Roman" w:hAnsi="Times New Roman" w:eastAsia="Times New Roman" w:cs="Times New Roman"/>
+          <w:b w:val="0"/>
+          <w:bCs w:val="0"/>
+          <w:i w:val="0"/>
+          <w:iCs w:val="0"/>
+          <w:noProof w:val="0"/>
+          <w:sz w:val="18"/>
+          <w:szCs w:val="18"/>
+          <w:lang w:val="en-GB"/>
+        </w:rPr>
+        <w:t xml:space="preserve"> </w:t>
+      </w:r>
+      <w:r>
+        <w:rPr>
+          <w:rFonts w:ascii="Times New Roman" w:hAnsi="Times New Roman" w:eastAsia="Times New Roman" w:cs="Times New Roman"/>
+          <w:b w:val="0"/>
+          <w:bCs w:val="0"/>
+          <w:i w:val="0"/>
+          <w:iCs w:val="0"/>
+          <w:noProof w:val="0"/>
+          <w:sz w:val="18"/>
+          <w:szCs w:val="18"/>
+          <w:lang w:val="en-GB"/>
+        </w:rPr>
+        <w:t>github</w:t>
+      </w:r>
     </w:p>
     <w:p>
       <w:pPr>
@@ -6756,7 +8560,7 @@
           <w:i w:val="0"/>
           <w:iCs w:val="0"/>
           <w:noProof w:val="0"/>
-          <w:color w:val="153D63" w:themeColor="text2" w:themeTint="E6" w:themeShade="FF"/>
+          <w:color w:val="0E2740" w:themeColor="text2" w:themeTint="E6" w:themeShade="FF"/>
           <w:sz w:val="18"/>
           <w:szCs w:val="18"/>
           <w:lang w:val="en-GB"/>

</xml_diff>